<commit_message>
Fixed temporary Word files
</commit_message>
<xml_diff>
--- a/documents/WEBDEV PROPOSAL 2.docx
+++ b/documents/WEBDEV PROPOSAL 2.docx
@@ -6,332 +6,343 @@
       <w:pPr>
         <w:jc w:val="center"/>
         <w:rPr>
+          <w:rFonts w:hint="default" w:ascii="Times New Roman" w:hAnsi="Times New Roman" w:eastAsia="Aptos" w:cs="Times New Roman"/>
+          <w:sz w:val="44"/>
+          <w:szCs w:val="44"/>
+          <w:lang w:val="en-US"/>
+        </w:rPr>
+      </w:pPr>
+      <w:r>
+        <w:rPr>
+          <w:rFonts w:hint="default" w:ascii="Times New Roman" w:hAnsi="Times New Roman" w:eastAsia="Aptos" w:cs="Times New Roman"/>
+          <w:b/>
+          <w:bCs/>
+          <w:sz w:val="44"/>
+          <w:szCs w:val="44"/>
+          <w:lang w:val="en-US"/>
+        </w:rPr>
+        <w:t>Subject Name:</w:t>
+      </w:r>
+      <w:r>
+        <w:rPr>
+          <w:rFonts w:hint="default" w:ascii="Times New Roman" w:hAnsi="Times New Roman" w:eastAsia="Aptos" w:cs="Times New Roman"/>
+          <w:sz w:val="44"/>
+          <w:szCs w:val="44"/>
+          <w:lang w:val="en-US"/>
+        </w:rPr>
+        <w:t xml:space="preserve"> Web Development Introduction </w:t>
+      </w:r>
+    </w:p>
+    <w:p>
+      <w:pPr>
+        <w:jc w:val="center"/>
+        <w:rPr>
+          <w:rFonts w:hint="default" w:ascii="Times New Roman" w:hAnsi="Times New Roman" w:eastAsia="Aptos" w:cs="Times New Roman"/>
+          <w:sz w:val="44"/>
+          <w:szCs w:val="44"/>
+          <w:lang w:val="en-US"/>
+        </w:rPr>
+      </w:pPr>
+    </w:p>
+    <w:p>
+      <w:pPr>
+        <w:jc w:val="center"/>
+        <w:rPr>
+          <w:rFonts w:hint="default" w:ascii="Times New Roman" w:hAnsi="Times New Roman" w:eastAsia="Aptos" w:cs="Times New Roman"/>
+          <w:sz w:val="44"/>
+          <w:szCs w:val="44"/>
+          <w:lang w:val="en-US"/>
+        </w:rPr>
+      </w:pPr>
+      <w:r>
+        <w:rPr>
+          <w:rFonts w:hint="default" w:ascii="Times New Roman" w:hAnsi="Times New Roman" w:eastAsia="Aptos" w:cs="Times New Roman"/>
+          <w:b/>
+          <w:bCs/>
+          <w:sz w:val="44"/>
+          <w:szCs w:val="44"/>
+          <w:lang w:val="en-US"/>
+        </w:rPr>
+        <w:t>Subject Code:</w:t>
+      </w:r>
+      <w:r>
+        <w:rPr>
+          <w:rFonts w:hint="default" w:ascii="Times New Roman" w:hAnsi="Times New Roman" w:eastAsia="Aptos" w:cs="Times New Roman"/>
+          <w:sz w:val="44"/>
+          <w:szCs w:val="44"/>
+          <w:lang w:val="en-US"/>
+        </w:rPr>
+        <w:t xml:space="preserve"> WEDE5020 </w:t>
+      </w:r>
+    </w:p>
+    <w:p>
+      <w:pPr>
+        <w:jc w:val="center"/>
+        <w:rPr>
+          <w:rFonts w:hint="default" w:ascii="Times New Roman" w:hAnsi="Times New Roman" w:eastAsia="Aptos" w:cs="Times New Roman"/>
+          <w:sz w:val="44"/>
+          <w:szCs w:val="44"/>
+          <w:lang w:val="en-US"/>
+        </w:rPr>
+      </w:pPr>
+    </w:p>
+    <w:p>
+      <w:pPr>
+        <w:jc w:val="center"/>
+        <w:rPr>
+          <w:rFonts w:hint="default" w:ascii="Times New Roman" w:hAnsi="Times New Roman" w:eastAsia="Aptos" w:cs="Times New Roman"/>
+          <w:sz w:val="44"/>
+          <w:szCs w:val="44"/>
+          <w:lang w:val="en-US"/>
+        </w:rPr>
+      </w:pPr>
+      <w:r>
+        <w:rPr>
+          <w:rFonts w:hint="default" w:ascii="Times New Roman" w:hAnsi="Times New Roman" w:eastAsia="Aptos" w:cs="Times New Roman"/>
+          <w:b/>
+          <w:bCs/>
+          <w:sz w:val="44"/>
+          <w:szCs w:val="44"/>
+          <w:lang w:val="en-US"/>
+        </w:rPr>
+        <w:t>Student Name:</w:t>
+      </w:r>
+      <w:r>
+        <w:rPr>
+          <w:rFonts w:hint="default" w:ascii="Times New Roman" w:hAnsi="Times New Roman" w:eastAsia="Aptos" w:cs="Times New Roman"/>
+          <w:sz w:val="44"/>
+          <w:szCs w:val="44"/>
+          <w:lang w:val="en-US"/>
+        </w:rPr>
+        <w:t xml:space="preserve"> Mamukeli Ndiweni </w:t>
+      </w:r>
+    </w:p>
+    <w:p>
+      <w:pPr>
+        <w:jc w:val="center"/>
+        <w:rPr>
+          <w:rFonts w:hint="default" w:ascii="Times New Roman" w:hAnsi="Times New Roman" w:eastAsia="Aptos" w:cs="Times New Roman"/>
+          <w:sz w:val="44"/>
+          <w:szCs w:val="44"/>
+          <w:lang w:val="en-US"/>
+        </w:rPr>
+      </w:pPr>
+    </w:p>
+    <w:p>
+      <w:pPr>
+        <w:jc w:val="center"/>
+        <w:rPr>
+          <w:rFonts w:hint="default" w:ascii="Times New Roman" w:hAnsi="Times New Roman" w:eastAsia="Aptos" w:cs="Times New Roman"/>
+          <w:b w:val="0"/>
+          <w:bCs w:val="0"/>
+          <w:sz w:val="44"/>
+          <w:szCs w:val="44"/>
+          <w:lang w:val="en-US"/>
+        </w:rPr>
+      </w:pPr>
+      <w:r>
+        <w:rPr>
+          <w:rFonts w:hint="default" w:ascii="Times New Roman" w:hAnsi="Times New Roman" w:eastAsia="Aptos" w:cs="Times New Roman"/>
+          <w:b/>
+          <w:bCs/>
+          <w:sz w:val="44"/>
+          <w:szCs w:val="44"/>
+          <w:lang w:val="en-US"/>
+        </w:rPr>
+        <w:t>Student Number:</w:t>
+      </w:r>
+      <w:r>
+        <w:rPr>
+          <w:rFonts w:hint="default" w:ascii="Times New Roman" w:hAnsi="Times New Roman" w:eastAsia="Aptos" w:cs="Times New Roman"/>
+          <w:b w:val="0"/>
+          <w:bCs w:val="0"/>
+          <w:sz w:val="44"/>
+          <w:szCs w:val="44"/>
+          <w:lang w:val="en-US"/>
+        </w:rPr>
+        <w:t xml:space="preserve"> ST10541377</w:t>
+      </w:r>
+    </w:p>
+    <w:p>
+      <w:pPr>
+        <w:jc w:val="center"/>
+        <w:rPr>
+          <w:rFonts w:hint="default" w:ascii="Times New Roman" w:hAnsi="Times New Roman" w:eastAsia="Aptos" w:cs="Times New Roman"/>
+          <w:b w:val="0"/>
+          <w:bCs w:val="0"/>
+          <w:sz w:val="44"/>
+          <w:szCs w:val="44"/>
+          <w:lang w:val="en-US"/>
+        </w:rPr>
+      </w:pPr>
+    </w:p>
+    <w:p>
+      <w:pPr>
+        <w:jc w:val="center"/>
+        <w:rPr>
+          <w:rFonts w:hint="default" w:ascii="Times New Roman" w:hAnsi="Times New Roman" w:eastAsia="Aptos" w:cs="Times New Roman"/>
+          <w:sz w:val="44"/>
+          <w:szCs w:val="44"/>
+          <w:lang w:val="en-US"/>
+        </w:rPr>
+      </w:pPr>
+      <w:r>
+        <w:rPr>
+          <w:rFonts w:hint="default" w:ascii="Times New Roman" w:hAnsi="Times New Roman" w:eastAsia="Aptos" w:cs="Times New Roman"/>
+          <w:b/>
+          <w:bCs/>
+          <w:sz w:val="44"/>
+          <w:szCs w:val="44"/>
+          <w:lang w:val="en-US"/>
+        </w:rPr>
+        <w:t>Date:</w:t>
+      </w:r>
+      <w:r>
+        <w:rPr>
+          <w:rFonts w:hint="default" w:ascii="Times New Roman" w:hAnsi="Times New Roman" w:eastAsia="Aptos" w:cs="Times New Roman"/>
+          <w:sz w:val="44"/>
+          <w:szCs w:val="44"/>
+          <w:lang w:val="en-US"/>
+        </w:rPr>
+        <w:t xml:space="preserve"> 17 April 2026 </w:t>
+      </w:r>
+    </w:p>
+    <w:p>
+      <w:pPr>
+        <w:jc w:val="center"/>
+        <w:rPr>
+          <w:rFonts w:hint="default" w:ascii="Times New Roman" w:hAnsi="Times New Roman" w:eastAsia="Aptos" w:cs="Times New Roman"/>
+          <w:sz w:val="44"/>
+          <w:szCs w:val="44"/>
+          <w:lang w:val="en-US"/>
+        </w:rPr>
+      </w:pPr>
+    </w:p>
+    <w:p>
+      <w:pPr>
+        <w:jc w:val="center"/>
+        <w:rPr>
+          <w:rFonts w:hint="default" w:ascii="Times New Roman" w:hAnsi="Times New Roman" w:eastAsia="Aptos" w:cs="Times New Roman"/>
+          <w:sz w:val="44"/>
+          <w:szCs w:val="44"/>
+          <w:lang w:val="en-US"/>
+        </w:rPr>
+      </w:pPr>
+      <w:r>
+        <w:rPr>
+          <w:rFonts w:hint="default" w:ascii="Times New Roman" w:hAnsi="Times New Roman" w:eastAsia="Aptos" w:cs="Times New Roman"/>
+          <w:b/>
+          <w:bCs/>
+          <w:sz w:val="44"/>
+          <w:szCs w:val="44"/>
+          <w:lang w:val="en-US"/>
+        </w:rPr>
+        <w:t>Assignment:</w:t>
+      </w:r>
+      <w:r>
+        <w:rPr>
+          <w:rFonts w:hint="default" w:ascii="Times New Roman" w:hAnsi="Times New Roman" w:eastAsia="Aptos" w:cs="Times New Roman"/>
+          <w:sz w:val="44"/>
+          <w:szCs w:val="44"/>
+          <w:lang w:val="en-US"/>
+        </w:rPr>
+        <w:t xml:space="preserve"> Web Development Project Part 1: Project Proposal</w:t>
+      </w:r>
+      <w:r>
+        <w:rPr>
+          <w:rFonts w:hint="default" w:ascii="Times New Roman" w:hAnsi="Times New Roman" w:eastAsia="Aptos" w:cs="Times New Roman"/>
+          <w:sz w:val="44"/>
+          <w:szCs w:val="44"/>
+          <w:lang w:val="en-ZA"/>
+        </w:rPr>
+        <w:t xml:space="preserve"> 2</w:t>
+      </w:r>
+      <w:r>
+        <w:rPr>
+          <w:rFonts w:hint="default" w:ascii="Times New Roman" w:hAnsi="Times New Roman" w:eastAsia="Aptos" w:cs="Times New Roman"/>
+          <w:sz w:val="44"/>
+          <w:szCs w:val="44"/>
+          <w:lang w:val="en-US"/>
+        </w:rPr>
+        <w:t>.</w:t>
+      </w:r>
+    </w:p>
+    <w:p>
+      <w:pPr>
+        <w:jc w:val="center"/>
+        <w:rPr>
+          <w:rFonts w:hint="default" w:ascii="Times New Roman" w:hAnsi="Times New Roman" w:eastAsia="Aptos" w:cs="Times New Roman"/>
+          <w:sz w:val="44"/>
+          <w:szCs w:val="44"/>
+          <w:lang w:val="en-ZA"/>
+        </w:rPr>
+      </w:pPr>
+      <w:r>
+        <w:rPr>
+          <w:rFonts w:hint="default" w:ascii="Times New Roman" w:hAnsi="Times New Roman" w:eastAsia="Aptos" w:cs="Times New Roman"/>
+          <w:sz w:val="44"/>
+          <w:szCs w:val="44"/>
+          <w:lang w:val="en-ZA"/>
+        </w:rPr>
+        <w:t>REAL CONNECTION CARPET CLEANERS</w:t>
+      </w:r>
+    </w:p>
+    <w:p>
+      <w:pPr>
+        <w:jc w:val="center"/>
+        <w:rPr>
           <w:rFonts w:ascii="Aptos" w:hAnsi="Aptos" w:eastAsia="Aptos" w:cs="Aptos"/>
           <w:sz w:val="36"/>
           <w:szCs w:val="36"/>
           <w:lang w:val="en-US"/>
         </w:rPr>
       </w:pPr>
-      <w:r>
-        <w:rPr>
-          <w:rFonts w:ascii="Aptos" w:hAnsi="Aptos" w:eastAsia="Aptos" w:cs="Aptos"/>
-          <w:b/>
-          <w:bCs/>
+    </w:p>
+    <w:p>
+      <w:pPr>
+        <w:jc w:val="both"/>
+        <w:rPr>
+          <w:rFonts w:ascii="Aptos" w:hAnsi="Aptos" w:eastAsia="Aptos" w:cs="Aptos"/>
           <w:sz w:val="36"/>
           <w:szCs w:val="36"/>
           <w:lang w:val="en-US"/>
         </w:rPr>
-        <w:t>Subject Name:</w:t>
-      </w:r>
-      <w:r>
+      </w:pPr>
+    </w:p>
+    <w:p>
+      <w:pPr>
+        <w:jc w:val="both"/>
         <w:rPr>
           <w:rFonts w:ascii="Aptos" w:hAnsi="Aptos" w:eastAsia="Aptos" w:cs="Aptos"/>
           <w:sz w:val="36"/>
           <w:szCs w:val="36"/>
           <w:lang w:val="en-US"/>
         </w:rPr>
-        <w:t xml:space="preserve"> Web Development Introduction </w:t>
-      </w:r>
-    </w:p>
-    <w:p>
-      <w:pPr>
-        <w:jc w:val="center"/>
-        <w:rPr>
-          <w:rFonts w:ascii="Aptos" w:hAnsi="Aptos" w:eastAsia="Aptos" w:cs="Aptos"/>
+      </w:pPr>
+    </w:p>
+    <w:p>
+      <w:pPr>
+        <w:pStyle w:val="2"/>
+        <w:spacing w:before="281" w:beforeAutospacing="0" w:after="281" w:afterAutospacing="0"/>
+        <w:jc w:val="left"/>
+        <w:rPr>
+          <w:rFonts w:hint="default" w:ascii="Times New Roman" w:hAnsi="Times New Roman" w:eastAsia="Aptos" w:cs="Times New Roman"/>
+          <w:b/>
+          <w:bCs/>
+          <w:color w:val="auto"/>
           <w:sz w:val="36"/>
           <w:szCs w:val="36"/>
           <w:lang w:val="en-US"/>
         </w:rPr>
       </w:pPr>
-    </w:p>
-    <w:p>
-      <w:pPr>
-        <w:jc w:val="center"/>
-        <w:rPr>
-          <w:rFonts w:ascii="Aptos" w:hAnsi="Aptos" w:eastAsia="Aptos" w:cs="Aptos"/>
+      <w:r>
+        <w:rPr>
+          <w:rFonts w:hint="default" w:ascii="Times New Roman" w:hAnsi="Times New Roman" w:eastAsia="Aptos" w:cs="Times New Roman"/>
+          <w:b/>
+          <w:bCs/>
+          <w:color w:val="auto"/>
           <w:sz w:val="36"/>
           <w:szCs w:val="36"/>
-          <w:lang w:val="en-US"/>
-        </w:rPr>
-      </w:pPr>
-      <w:r>
-        <w:rPr>
-          <w:rFonts w:ascii="Aptos" w:hAnsi="Aptos" w:eastAsia="Aptos" w:cs="Aptos"/>
-          <w:b/>
-          <w:bCs/>
-          <w:sz w:val="36"/>
-          <w:szCs w:val="36"/>
-          <w:lang w:val="en-US"/>
-        </w:rPr>
-        <w:t>Subject Code:</w:t>
-      </w:r>
-      <w:r>
-        <w:rPr>
-          <w:rFonts w:ascii="Aptos" w:hAnsi="Aptos" w:eastAsia="Aptos" w:cs="Aptos"/>
-          <w:sz w:val="36"/>
-          <w:szCs w:val="36"/>
-          <w:lang w:val="en-US"/>
-        </w:rPr>
-        <w:t xml:space="preserve"> WEDE5020 </w:t>
-      </w:r>
-    </w:p>
-    <w:p>
-      <w:pPr>
-        <w:jc w:val="center"/>
-        <w:rPr>
-          <w:rFonts w:ascii="Aptos" w:hAnsi="Aptos" w:eastAsia="Aptos" w:cs="Aptos"/>
-          <w:sz w:val="36"/>
-          <w:szCs w:val="36"/>
-          <w:lang w:val="en-US"/>
-        </w:rPr>
-      </w:pPr>
-    </w:p>
-    <w:p>
-      <w:pPr>
-        <w:jc w:val="center"/>
-        <w:rPr>
-          <w:rFonts w:ascii="Aptos" w:hAnsi="Aptos" w:eastAsia="Aptos" w:cs="Aptos"/>
-          <w:sz w:val="36"/>
-          <w:szCs w:val="36"/>
-          <w:lang w:val="en-US"/>
-        </w:rPr>
-      </w:pPr>
-      <w:r>
-        <w:rPr>
-          <w:rFonts w:ascii="Aptos" w:hAnsi="Aptos" w:eastAsia="Aptos" w:cs="Aptos"/>
-          <w:b/>
-          <w:bCs/>
-          <w:sz w:val="36"/>
-          <w:szCs w:val="36"/>
-          <w:lang w:val="en-US"/>
-        </w:rPr>
-        <w:t>Student Name:</w:t>
-      </w:r>
-      <w:r>
-        <w:rPr>
-          <w:rFonts w:ascii="Aptos" w:hAnsi="Aptos" w:eastAsia="Aptos" w:cs="Aptos"/>
-          <w:sz w:val="36"/>
-          <w:szCs w:val="36"/>
-          <w:lang w:val="en-US"/>
-        </w:rPr>
-        <w:t xml:space="preserve"> Mamukeli Ndiweni </w:t>
-      </w:r>
-    </w:p>
-    <w:p>
-      <w:pPr>
-        <w:jc w:val="center"/>
-        <w:rPr>
-          <w:rFonts w:ascii="Aptos" w:hAnsi="Aptos" w:eastAsia="Aptos" w:cs="Aptos"/>
-          <w:sz w:val="36"/>
-          <w:szCs w:val="36"/>
-          <w:lang w:val="en-US"/>
-        </w:rPr>
-      </w:pPr>
-    </w:p>
-    <w:p>
-      <w:pPr>
-        <w:jc w:val="center"/>
-        <w:rPr>
-          <w:rFonts w:ascii="Aptos" w:hAnsi="Aptos" w:eastAsia="Aptos" w:cs="Aptos"/>
-          <w:b w:val="0"/>
-          <w:bCs w:val="0"/>
-          <w:sz w:val="36"/>
-          <w:szCs w:val="36"/>
-          <w:lang w:val="en-US"/>
-        </w:rPr>
-      </w:pPr>
-      <w:r>
-        <w:rPr>
-          <w:rFonts w:ascii="Aptos" w:hAnsi="Aptos" w:eastAsia="Aptos" w:cs="Aptos"/>
-          <w:b/>
-          <w:bCs/>
-          <w:sz w:val="36"/>
-          <w:szCs w:val="36"/>
-          <w:lang w:val="en-US"/>
-        </w:rPr>
-        <w:t>Student Number:</w:t>
-      </w:r>
-      <w:r>
-        <w:rPr>
-          <w:rFonts w:ascii="Aptos" w:hAnsi="Aptos" w:eastAsia="Aptos" w:cs="Aptos"/>
-          <w:b w:val="0"/>
-          <w:bCs w:val="0"/>
-          <w:sz w:val="36"/>
-          <w:szCs w:val="36"/>
-          <w:lang w:val="en-US"/>
-        </w:rPr>
-        <w:t xml:space="preserve"> ST10541377</w:t>
-      </w:r>
-    </w:p>
-    <w:p>
-      <w:pPr>
-        <w:jc w:val="center"/>
-        <w:rPr>
-          <w:rFonts w:ascii="Aptos" w:hAnsi="Aptos" w:eastAsia="Aptos" w:cs="Aptos"/>
-          <w:b w:val="0"/>
-          <w:bCs w:val="0"/>
-          <w:sz w:val="36"/>
-          <w:szCs w:val="36"/>
-          <w:lang w:val="en-US"/>
-        </w:rPr>
-      </w:pPr>
-    </w:p>
-    <w:p>
-      <w:pPr>
-        <w:jc w:val="center"/>
-        <w:rPr>
-          <w:rFonts w:ascii="Aptos" w:hAnsi="Aptos" w:eastAsia="Aptos" w:cs="Aptos"/>
-          <w:sz w:val="36"/>
-          <w:szCs w:val="36"/>
-          <w:lang w:val="en-US"/>
-        </w:rPr>
-      </w:pPr>
-      <w:r>
-        <w:rPr>
-          <w:rFonts w:ascii="Aptos" w:hAnsi="Aptos" w:eastAsia="Aptos" w:cs="Aptos"/>
-          <w:b/>
-          <w:bCs/>
-          <w:sz w:val="36"/>
-          <w:szCs w:val="36"/>
-          <w:lang w:val="en-US"/>
-        </w:rPr>
-        <w:t>Date:</w:t>
-      </w:r>
-      <w:r>
-        <w:rPr>
-          <w:rFonts w:ascii="Aptos" w:hAnsi="Aptos" w:eastAsia="Aptos" w:cs="Aptos"/>
-          <w:sz w:val="36"/>
-          <w:szCs w:val="36"/>
-          <w:lang w:val="en-US"/>
-        </w:rPr>
-        <w:t xml:space="preserve"> 17 April 2026 </w:t>
-      </w:r>
-    </w:p>
-    <w:p>
-      <w:pPr>
-        <w:jc w:val="center"/>
-        <w:rPr>
-          <w:rFonts w:ascii="Aptos" w:hAnsi="Aptos" w:eastAsia="Aptos" w:cs="Aptos"/>
-          <w:sz w:val="36"/>
-          <w:szCs w:val="36"/>
-          <w:lang w:val="en-US"/>
-        </w:rPr>
-      </w:pPr>
-    </w:p>
-    <w:p>
-      <w:pPr>
-        <w:jc w:val="center"/>
-        <w:rPr>
-          <w:rFonts w:ascii="Aptos" w:hAnsi="Aptos" w:eastAsia="Aptos" w:cs="Aptos"/>
-          <w:sz w:val="36"/>
-          <w:szCs w:val="36"/>
-          <w:lang w:val="en-US"/>
-        </w:rPr>
-      </w:pPr>
-      <w:r>
-        <w:rPr>
-          <w:rFonts w:ascii="Aptos" w:hAnsi="Aptos" w:eastAsia="Aptos" w:cs="Aptos"/>
-          <w:b/>
-          <w:bCs/>
-          <w:sz w:val="36"/>
-          <w:szCs w:val="36"/>
-          <w:lang w:val="en-US"/>
-        </w:rPr>
-        <w:t>Assignment:</w:t>
-      </w:r>
-      <w:r>
-        <w:rPr>
-          <w:rFonts w:ascii="Aptos" w:hAnsi="Aptos" w:eastAsia="Aptos" w:cs="Aptos"/>
-          <w:sz w:val="36"/>
-          <w:szCs w:val="36"/>
-          <w:lang w:val="en-US"/>
-        </w:rPr>
-        <w:t xml:space="preserve"> Web Development Project Part 1: Project Proposal</w:t>
-      </w:r>
-      <w:r>
-        <w:rPr>
-          <w:rFonts w:hint="default" w:ascii="Aptos" w:hAnsi="Aptos" w:eastAsia="Aptos" w:cs="Aptos"/>
-          <w:sz w:val="36"/>
-          <w:szCs w:val="36"/>
-          <w:lang w:val="en-ZA"/>
-        </w:rPr>
-        <w:t xml:space="preserve"> 2</w:t>
-      </w:r>
-      <w:r>
-        <w:rPr>
-          <w:rFonts w:ascii="Aptos" w:hAnsi="Aptos" w:eastAsia="Aptos" w:cs="Aptos"/>
-          <w:sz w:val="36"/>
-          <w:szCs w:val="36"/>
-          <w:lang w:val="en-US"/>
-        </w:rPr>
-        <w:t>.</w:t>
-      </w:r>
-    </w:p>
-    <w:p>
-      <w:pPr>
-        <w:jc w:val="center"/>
-        <w:rPr>
-          <w:rFonts w:hint="default" w:ascii="Aptos" w:hAnsi="Aptos" w:eastAsia="Aptos" w:cs="Aptos"/>
-          <w:sz w:val="36"/>
-          <w:szCs w:val="36"/>
-          <w:lang w:val="en-ZA"/>
-        </w:rPr>
-      </w:pPr>
-      <w:r>
-        <w:rPr>
-          <w:rFonts w:hint="default" w:ascii="Aptos" w:hAnsi="Aptos" w:eastAsia="Aptos" w:cs="Aptos"/>
-          <w:sz w:val="36"/>
-          <w:szCs w:val="36"/>
-          <w:lang w:val="en-ZA"/>
-        </w:rPr>
-        <w:t>REAL CONNECTION CARPET CLEANERS</w:t>
-      </w:r>
-    </w:p>
-    <w:p>
-      <w:pPr>
-        <w:jc w:val="center"/>
-        <w:rPr>
-          <w:rFonts w:ascii="Aptos" w:hAnsi="Aptos" w:eastAsia="Aptos" w:cs="Aptos"/>
-          <w:sz w:val="36"/>
-          <w:szCs w:val="36"/>
-          <w:lang w:val="en-US"/>
-        </w:rPr>
-      </w:pPr>
-    </w:p>
-    <w:p>
-      <w:pPr>
-        <w:jc w:val="both"/>
-        <w:rPr>
-          <w:rFonts w:ascii="Aptos" w:hAnsi="Aptos" w:eastAsia="Aptos" w:cs="Aptos"/>
-          <w:sz w:val="36"/>
-          <w:szCs w:val="36"/>
-          <w:lang w:val="en-US"/>
-        </w:rPr>
-      </w:pPr>
-    </w:p>
-    <w:p>
-      <w:pPr>
-        <w:pStyle w:val="2"/>
-        <w:spacing w:before="281" w:beforeAutospacing="0" w:after="281" w:afterAutospacing="0"/>
-        <w:jc w:val="left"/>
-        <w:rPr>
-          <w:rFonts w:ascii="Aptos" w:hAnsi="Aptos" w:eastAsia="Aptos" w:cs="Aptos"/>
-          <w:b/>
-          <w:bCs/>
-          <w:color w:val="auto"/>
-          <w:sz w:val="22"/>
-          <w:szCs w:val="22"/>
-          <w:lang w:val="en-US"/>
-        </w:rPr>
-      </w:pPr>
-      <w:r>
-        <w:rPr>
-          <w:rFonts w:ascii="Aptos" w:hAnsi="Aptos" w:eastAsia="Aptos" w:cs="Aptos"/>
-          <w:b/>
-          <w:bCs/>
-          <w:color w:val="auto"/>
-          <w:sz w:val="22"/>
-          <w:szCs w:val="22"/>
           <w:lang w:val="en-US"/>
         </w:rPr>
         <w:t>TABLE OF CONTENTS</w:t>
@@ -347,19 +358,19 @@
         <w:spacing w:before="240" w:beforeAutospacing="0" w:after="240" w:afterAutospacing="0"/>
         <w:jc w:val="left"/>
         <w:rPr>
-          <w:rFonts w:ascii="Aptos" w:hAnsi="Aptos" w:eastAsia="Aptos" w:cs="Aptos"/>
+          <w:rFonts w:hint="default" w:ascii="Times New Roman" w:hAnsi="Times New Roman" w:eastAsia="Aptos" w:cs="Times New Roman"/>
           <w:color w:val="auto"/>
-          <w:sz w:val="22"/>
-          <w:szCs w:val="22"/>
-          <w:lang w:val="en-US"/>
-        </w:rPr>
-      </w:pPr>
-      <w:r>
-        <w:rPr>
-          <w:rFonts w:ascii="Aptos" w:hAnsi="Aptos" w:eastAsia="Aptos" w:cs="Aptos"/>
+          <w:sz w:val="36"/>
+          <w:szCs w:val="36"/>
+          <w:lang w:val="en-US"/>
+        </w:rPr>
+      </w:pPr>
+      <w:r>
+        <w:rPr>
+          <w:rFonts w:hint="default" w:ascii="Times New Roman" w:hAnsi="Times New Roman" w:eastAsia="Aptos" w:cs="Times New Roman"/>
           <w:color w:val="auto"/>
-          <w:sz w:val="22"/>
-          <w:szCs w:val="22"/>
+          <w:sz w:val="36"/>
+          <w:szCs w:val="36"/>
           <w:lang w:val="en-US"/>
         </w:rPr>
         <w:t>Organization Overview ........................... Page 1</w:t>
@@ -375,19 +386,19 @@
         <w:spacing w:before="240" w:beforeAutospacing="0" w:after="240" w:afterAutospacing="0"/>
         <w:jc w:val="left"/>
         <w:rPr>
-          <w:rFonts w:ascii="Aptos" w:hAnsi="Aptos" w:eastAsia="Aptos" w:cs="Aptos"/>
+          <w:rFonts w:hint="default" w:ascii="Times New Roman" w:hAnsi="Times New Roman" w:eastAsia="Aptos" w:cs="Times New Roman"/>
           <w:color w:val="auto"/>
-          <w:sz w:val="22"/>
-          <w:szCs w:val="22"/>
-          <w:lang w:val="en-US"/>
-        </w:rPr>
-      </w:pPr>
-      <w:r>
-        <w:rPr>
-          <w:rFonts w:ascii="Aptos" w:hAnsi="Aptos" w:eastAsia="Aptos" w:cs="Aptos"/>
+          <w:sz w:val="36"/>
+          <w:szCs w:val="36"/>
+          <w:lang w:val="en-US"/>
+        </w:rPr>
+      </w:pPr>
+      <w:r>
+        <w:rPr>
+          <w:rFonts w:hint="default" w:ascii="Times New Roman" w:hAnsi="Times New Roman" w:eastAsia="Aptos" w:cs="Times New Roman"/>
           <w:color w:val="auto"/>
-          <w:sz w:val="22"/>
-          <w:szCs w:val="22"/>
+          <w:sz w:val="36"/>
+          <w:szCs w:val="36"/>
           <w:lang w:val="en-US"/>
         </w:rPr>
         <w:t>Website Goals and Objectives ................. Page 1</w:t>
@@ -403,19 +414,19 @@
         <w:spacing w:before="240" w:beforeAutospacing="0" w:after="240" w:afterAutospacing="0"/>
         <w:jc w:val="left"/>
         <w:rPr>
-          <w:rFonts w:ascii="Aptos" w:hAnsi="Aptos" w:eastAsia="Aptos" w:cs="Aptos"/>
+          <w:rFonts w:hint="default" w:ascii="Times New Roman" w:hAnsi="Times New Roman" w:eastAsia="Aptos" w:cs="Times New Roman"/>
           <w:color w:val="auto"/>
-          <w:sz w:val="22"/>
-          <w:szCs w:val="22"/>
-          <w:lang w:val="en-US"/>
-        </w:rPr>
-      </w:pPr>
-      <w:r>
-        <w:rPr>
-          <w:rFonts w:ascii="Aptos" w:hAnsi="Aptos" w:eastAsia="Aptos" w:cs="Aptos"/>
+          <w:sz w:val="36"/>
+          <w:szCs w:val="36"/>
+          <w:lang w:val="en-US"/>
+        </w:rPr>
+      </w:pPr>
+      <w:r>
+        <w:rPr>
+          <w:rFonts w:hint="default" w:ascii="Times New Roman" w:hAnsi="Times New Roman" w:eastAsia="Aptos" w:cs="Times New Roman"/>
           <w:color w:val="auto"/>
-          <w:sz w:val="22"/>
-          <w:szCs w:val="22"/>
+          <w:sz w:val="36"/>
+          <w:szCs w:val="36"/>
           <w:lang w:val="en-US"/>
         </w:rPr>
         <w:t>Proposed Features and Functionality ....... Page 2</w:t>
@@ -431,19 +442,19 @@
         <w:spacing w:before="240" w:beforeAutospacing="0" w:after="240" w:afterAutospacing="0"/>
         <w:jc w:val="left"/>
         <w:rPr>
-          <w:rFonts w:ascii="Aptos" w:hAnsi="Aptos" w:eastAsia="Aptos" w:cs="Aptos"/>
+          <w:rFonts w:hint="default" w:ascii="Times New Roman" w:hAnsi="Times New Roman" w:eastAsia="Aptos" w:cs="Times New Roman"/>
           <w:color w:val="auto"/>
-          <w:sz w:val="22"/>
-          <w:szCs w:val="22"/>
-          <w:lang w:val="en-US"/>
-        </w:rPr>
-      </w:pPr>
-      <w:r>
-        <w:rPr>
-          <w:rFonts w:ascii="Aptos" w:hAnsi="Aptos" w:eastAsia="Aptos" w:cs="Aptos"/>
+          <w:sz w:val="36"/>
+          <w:szCs w:val="36"/>
+          <w:lang w:val="en-US"/>
+        </w:rPr>
+      </w:pPr>
+      <w:r>
+        <w:rPr>
+          <w:rFonts w:hint="default" w:ascii="Times New Roman" w:hAnsi="Times New Roman" w:eastAsia="Aptos" w:cs="Times New Roman"/>
           <w:color w:val="auto"/>
-          <w:sz w:val="22"/>
-          <w:szCs w:val="22"/>
+          <w:sz w:val="36"/>
+          <w:szCs w:val="36"/>
           <w:lang w:val="en-US"/>
         </w:rPr>
         <w:t>Design and User Experience ................... Page 2</w:t>
@@ -459,19 +470,19 @@
         <w:spacing w:before="240" w:beforeAutospacing="0" w:after="240" w:afterAutospacing="0"/>
         <w:jc w:val="left"/>
         <w:rPr>
-          <w:rFonts w:ascii="Aptos" w:hAnsi="Aptos" w:eastAsia="Aptos" w:cs="Aptos"/>
+          <w:rFonts w:hint="default" w:ascii="Times New Roman" w:hAnsi="Times New Roman" w:eastAsia="Aptos" w:cs="Times New Roman"/>
           <w:color w:val="auto"/>
-          <w:sz w:val="22"/>
-          <w:szCs w:val="22"/>
-          <w:lang w:val="en-US"/>
-        </w:rPr>
-      </w:pPr>
-      <w:r>
-        <w:rPr>
-          <w:rFonts w:ascii="Aptos" w:hAnsi="Aptos" w:eastAsia="Aptos" w:cs="Aptos"/>
+          <w:sz w:val="36"/>
+          <w:szCs w:val="36"/>
+          <w:lang w:val="en-US"/>
+        </w:rPr>
+      </w:pPr>
+      <w:r>
+        <w:rPr>
+          <w:rFonts w:hint="default" w:ascii="Times New Roman" w:hAnsi="Times New Roman" w:eastAsia="Aptos" w:cs="Times New Roman"/>
           <w:color w:val="auto"/>
-          <w:sz w:val="22"/>
-          <w:szCs w:val="22"/>
+          <w:sz w:val="36"/>
+          <w:szCs w:val="36"/>
           <w:lang w:val="en-US"/>
         </w:rPr>
         <w:t>Technical Requirements .......................... Page 3</w:t>
@@ -487,19 +498,19 @@
         <w:spacing w:before="240" w:beforeAutospacing="0" w:after="240" w:afterAutospacing="0"/>
         <w:jc w:val="left"/>
         <w:rPr>
-          <w:rFonts w:ascii="Aptos" w:hAnsi="Aptos" w:eastAsia="Aptos" w:cs="Aptos"/>
+          <w:rFonts w:hint="default" w:ascii="Times New Roman" w:hAnsi="Times New Roman" w:eastAsia="Aptos" w:cs="Times New Roman"/>
           <w:color w:val="auto"/>
-          <w:sz w:val="22"/>
-          <w:szCs w:val="22"/>
-          <w:lang w:val="en-US"/>
-        </w:rPr>
-      </w:pPr>
-      <w:r>
-        <w:rPr>
-          <w:rFonts w:ascii="Aptos" w:hAnsi="Aptos" w:eastAsia="Aptos" w:cs="Aptos"/>
+          <w:sz w:val="36"/>
+          <w:szCs w:val="36"/>
+          <w:lang w:val="en-US"/>
+        </w:rPr>
+      </w:pPr>
+      <w:r>
+        <w:rPr>
+          <w:rFonts w:hint="default" w:ascii="Times New Roman" w:hAnsi="Times New Roman" w:eastAsia="Aptos" w:cs="Times New Roman"/>
           <w:color w:val="auto"/>
-          <w:sz w:val="22"/>
-          <w:szCs w:val="22"/>
+          <w:sz w:val="36"/>
+          <w:szCs w:val="36"/>
           <w:lang w:val="en-US"/>
         </w:rPr>
         <w:t>Timeline and Milestones ......................... Page 3</w:t>
@@ -515,19 +526,19 @@
         <w:spacing w:before="240" w:beforeAutospacing="0" w:after="240" w:afterAutospacing="0"/>
         <w:jc w:val="left"/>
         <w:rPr>
-          <w:rFonts w:ascii="Aptos" w:hAnsi="Aptos" w:eastAsia="Aptos" w:cs="Aptos"/>
+          <w:rFonts w:hint="default" w:ascii="Times New Roman" w:hAnsi="Times New Roman" w:eastAsia="Aptos" w:cs="Times New Roman"/>
           <w:color w:val="auto"/>
-          <w:sz w:val="22"/>
-          <w:szCs w:val="22"/>
-          <w:lang w:val="en-US"/>
-        </w:rPr>
-      </w:pPr>
-      <w:r>
-        <w:rPr>
-          <w:rFonts w:ascii="Aptos" w:hAnsi="Aptos" w:eastAsia="Aptos" w:cs="Aptos"/>
+          <w:sz w:val="36"/>
+          <w:szCs w:val="36"/>
+          <w:lang w:val="en-US"/>
+        </w:rPr>
+      </w:pPr>
+      <w:r>
+        <w:rPr>
+          <w:rFonts w:hint="default" w:ascii="Times New Roman" w:hAnsi="Times New Roman" w:eastAsia="Aptos" w:cs="Times New Roman"/>
           <w:color w:val="auto"/>
-          <w:sz w:val="22"/>
-          <w:szCs w:val="22"/>
+          <w:sz w:val="36"/>
+          <w:szCs w:val="36"/>
           <w:lang w:val="en-US"/>
         </w:rPr>
         <w:t>Budget .................................................... Page 4</w:t>
@@ -543,19 +554,19 @@
         <w:spacing w:before="240" w:beforeAutospacing="0" w:after="240" w:afterAutospacing="0"/>
         <w:jc w:val="left"/>
         <w:rPr>
-          <w:rFonts w:ascii="Aptos" w:hAnsi="Aptos" w:eastAsia="Aptos" w:cs="Aptos"/>
+          <w:rFonts w:hint="default" w:ascii="Times New Roman" w:hAnsi="Times New Roman" w:eastAsia="Aptos" w:cs="Times New Roman"/>
           <w:color w:val="auto"/>
-          <w:sz w:val="22"/>
-          <w:szCs w:val="22"/>
-          <w:lang w:val="en-US"/>
-        </w:rPr>
-      </w:pPr>
-      <w:r>
-        <w:rPr>
-          <w:rFonts w:ascii="Aptos" w:hAnsi="Aptos" w:eastAsia="Aptos" w:cs="Aptos"/>
+          <w:sz w:val="36"/>
+          <w:szCs w:val="36"/>
+          <w:lang w:val="en-US"/>
+        </w:rPr>
+      </w:pPr>
+      <w:r>
+        <w:rPr>
+          <w:rFonts w:hint="default" w:ascii="Times New Roman" w:hAnsi="Times New Roman" w:eastAsia="Aptos" w:cs="Times New Roman"/>
           <w:color w:val="auto"/>
-          <w:sz w:val="22"/>
-          <w:szCs w:val="22"/>
+          <w:sz w:val="36"/>
+          <w:szCs w:val="36"/>
           <w:lang w:val="en-US"/>
         </w:rPr>
         <w:t>References .............................................. Page 5</w:t>
@@ -565,9 +576,9 @@
       <w:pPr>
         <w:jc w:val="left"/>
         <w:rPr>
-          <w:rFonts w:ascii="Aptos" w:hAnsi="Aptos" w:eastAsia="Aptos" w:cs="Aptos"/>
-          <w:sz w:val="22"/>
-          <w:szCs w:val="22"/>
+          <w:rFonts w:hint="default" w:ascii="Times New Roman" w:hAnsi="Times New Roman" w:eastAsia="Aptos" w:cs="Times New Roman"/>
+          <w:sz w:val="36"/>
+          <w:szCs w:val="36"/>
           <w:lang w:val="en-US"/>
         </w:rPr>
       </w:pPr>
@@ -703,23 +714,21 @@
         <w:spacing w:before="0" w:beforeAutospacing="0" w:after="281" w:afterAutospacing="0"/>
         <w:jc w:val="left"/>
         <w:rPr>
-          <w:rFonts w:ascii="Aptos" w:hAnsi="Aptos" w:eastAsia="Aptos" w:cs="Aptos"/>
-          <w:b/>
-          <w:bCs/>
-          <w:sz w:val="22"/>
-          <w:szCs w:val="22"/>
-          <w:lang w:val="en-US"/>
-        </w:rPr>
-      </w:pPr>
-      <w:bookmarkStart w:id="0" w:name="_GoBack"/>
-      <w:bookmarkEnd w:id="0"/>
-      <w:r>
-        <w:rPr>
-          <w:rFonts w:ascii="Aptos" w:hAnsi="Aptos" w:eastAsia="Aptos" w:cs="Aptos"/>
-          <w:b/>
-          <w:bCs/>
-          <w:sz w:val="22"/>
-          <w:szCs w:val="22"/>
+          <w:rFonts w:hint="default" w:ascii="Times New Roman" w:hAnsi="Times New Roman" w:eastAsia="Aptos" w:cs="Times New Roman"/>
+          <w:b/>
+          <w:bCs/>
+          <w:sz w:val="24"/>
+          <w:szCs w:val="24"/>
+          <w:lang w:val="en-US"/>
+        </w:rPr>
+      </w:pPr>
+      <w:r>
+        <w:rPr>
+          <w:rFonts w:hint="default" w:ascii="Times New Roman" w:hAnsi="Times New Roman" w:eastAsia="Aptos" w:cs="Times New Roman"/>
+          <w:b/>
+          <w:bCs/>
+          <w:sz w:val="24"/>
+          <w:szCs w:val="24"/>
           <w:lang w:val="en-US"/>
         </w:rPr>
         <w:t>1. ORGANISATION OVERVIEW</w:t>
@@ -730,48 +739,48 @@
         <w:spacing w:before="0" w:beforeAutospacing="0" w:after="240" w:afterAutospacing="0"/>
         <w:jc w:val="left"/>
         <w:rPr>
-          <w:rFonts w:ascii="Aptos" w:hAnsi="Aptos" w:eastAsia="Aptos" w:cs="Aptos"/>
-          <w:sz w:val="22"/>
-          <w:szCs w:val="22"/>
-          <w:lang w:val="en-US"/>
-        </w:rPr>
-      </w:pPr>
-      <w:r>
-        <w:rPr>
-          <w:rFonts w:ascii="Aptos" w:hAnsi="Aptos" w:eastAsia="Aptos" w:cs="Aptos"/>
-          <w:b/>
-          <w:bCs/>
-          <w:sz w:val="22"/>
-          <w:szCs w:val="22"/>
+          <w:rFonts w:hint="default" w:ascii="Times New Roman" w:hAnsi="Times New Roman" w:eastAsia="Aptos" w:cs="Times New Roman"/>
+          <w:sz w:val="24"/>
+          <w:szCs w:val="24"/>
+          <w:lang w:val="en-US"/>
+        </w:rPr>
+      </w:pPr>
+      <w:r>
+        <w:rPr>
+          <w:rFonts w:hint="default" w:ascii="Times New Roman" w:hAnsi="Times New Roman" w:eastAsia="Aptos" w:cs="Times New Roman"/>
+          <w:b/>
+          <w:bCs/>
+          <w:sz w:val="24"/>
+          <w:szCs w:val="24"/>
           <w:lang w:val="en-US"/>
         </w:rPr>
         <w:t>Real Connection Carpet Cleaning</w:t>
       </w:r>
       <w:r>
         <w:rPr>
-          <w:rFonts w:ascii="Aptos" w:hAnsi="Aptos" w:eastAsia="Aptos" w:cs="Aptos"/>
-          <w:sz w:val="22"/>
-          <w:szCs w:val="22"/>
+          <w:rFonts w:hint="default" w:ascii="Times New Roman" w:hAnsi="Times New Roman" w:eastAsia="Aptos" w:cs="Times New Roman"/>
+          <w:sz w:val="24"/>
+          <w:szCs w:val="24"/>
           <w:lang w:val="en-US"/>
         </w:rPr>
         <w:t xml:space="preserve"> operates within the competitive Western Cape sanitation sector. As noted by </w:t>
       </w:r>
       <w:r>
         <w:rPr>
-          <w:rFonts w:ascii="Aptos" w:hAnsi="Aptos" w:eastAsia="Aptos" w:cs="Aptos"/>
-          <w:b/>
-          <w:bCs/>
-          <w:sz w:val="22"/>
-          <w:szCs w:val="22"/>
+          <w:rFonts w:hint="default" w:ascii="Times New Roman" w:hAnsi="Times New Roman" w:eastAsia="Aptos" w:cs="Times New Roman"/>
+          <w:b/>
+          <w:bCs/>
+          <w:sz w:val="24"/>
+          <w:szCs w:val="24"/>
           <w:lang w:val="en-US"/>
         </w:rPr>
         <w:t>Statista (2025)</w:t>
       </w:r>
       <w:r>
         <w:rPr>
-          <w:rFonts w:ascii="Aptos" w:hAnsi="Aptos" w:eastAsia="Aptos" w:cs="Aptos"/>
-          <w:sz w:val="22"/>
-          <w:szCs w:val="22"/>
+          <w:rFonts w:hint="default" w:ascii="Times New Roman" w:hAnsi="Times New Roman" w:eastAsia="Aptos" w:cs="Times New Roman"/>
+          <w:sz w:val="24"/>
+          <w:szCs w:val="24"/>
           <w:lang w:val="en-US"/>
         </w:rPr>
         <w:t>, the rise in internet penetration in South Africa has shifted consumer behavior, requiring small businesses to move from traditional word of mouth to professional digital identities to remain viable in the hospitality market.</w:t>
@@ -787,28 +796,28 @@
         <w:spacing w:before="240" w:beforeAutospacing="0" w:after="240" w:afterAutospacing="0"/>
         <w:jc w:val="left"/>
         <w:rPr>
-          <w:rFonts w:ascii="Aptos" w:hAnsi="Aptos" w:eastAsia="Aptos" w:cs="Aptos"/>
-          <w:sz w:val="22"/>
-          <w:szCs w:val="22"/>
-          <w:lang w:val="en-US"/>
-        </w:rPr>
-      </w:pPr>
-      <w:r>
-        <w:rPr>
-          <w:rFonts w:ascii="Aptos" w:hAnsi="Aptos" w:eastAsia="Aptos" w:cs="Aptos"/>
-          <w:b/>
-          <w:bCs/>
-          <w:sz w:val="22"/>
-          <w:szCs w:val="22"/>
+          <w:rFonts w:hint="default" w:ascii="Times New Roman" w:hAnsi="Times New Roman" w:eastAsia="Aptos" w:cs="Times New Roman"/>
+          <w:sz w:val="24"/>
+          <w:szCs w:val="24"/>
+          <w:lang w:val="en-US"/>
+        </w:rPr>
+      </w:pPr>
+      <w:r>
+        <w:rPr>
+          <w:rFonts w:hint="default" w:ascii="Times New Roman" w:hAnsi="Times New Roman" w:eastAsia="Aptos" w:cs="Times New Roman"/>
+          <w:b/>
+          <w:bCs/>
+          <w:sz w:val="24"/>
+          <w:szCs w:val="24"/>
           <w:lang w:val="en-US"/>
         </w:rPr>
         <w:t>Mission:</w:t>
       </w:r>
       <w:r>
         <w:rPr>
-          <w:rFonts w:ascii="Aptos" w:hAnsi="Aptos" w:eastAsia="Aptos" w:cs="Aptos"/>
-          <w:sz w:val="22"/>
-          <w:szCs w:val="22"/>
+          <w:rFonts w:hint="default" w:ascii="Times New Roman" w:hAnsi="Times New Roman" w:eastAsia="Aptos" w:cs="Times New Roman"/>
+          <w:sz w:val="24"/>
+          <w:szCs w:val="24"/>
           <w:lang w:val="en-US"/>
         </w:rPr>
         <w:t xml:space="preserve"> To deliver root level cleanliness through advanced steam extraction technology, ensuring allergen free and professional environments.</w:t>
@@ -824,28 +833,28 @@
         <w:spacing w:before="240" w:beforeAutospacing="0" w:after="240" w:afterAutospacing="0"/>
         <w:jc w:val="left"/>
         <w:rPr>
-          <w:rFonts w:ascii="Aptos" w:hAnsi="Aptos" w:eastAsia="Aptos" w:cs="Aptos"/>
-          <w:sz w:val="22"/>
-          <w:szCs w:val="22"/>
-          <w:lang w:val="en-US"/>
-        </w:rPr>
-      </w:pPr>
-      <w:r>
-        <w:rPr>
-          <w:rFonts w:ascii="Aptos" w:hAnsi="Aptos" w:eastAsia="Aptos" w:cs="Aptos"/>
-          <w:b/>
-          <w:bCs/>
-          <w:sz w:val="22"/>
-          <w:szCs w:val="22"/>
+          <w:rFonts w:hint="default" w:ascii="Times New Roman" w:hAnsi="Times New Roman" w:eastAsia="Aptos" w:cs="Times New Roman"/>
+          <w:sz w:val="24"/>
+          <w:szCs w:val="24"/>
+          <w:lang w:val="en-US"/>
+        </w:rPr>
+      </w:pPr>
+      <w:r>
+        <w:rPr>
+          <w:rFonts w:hint="default" w:ascii="Times New Roman" w:hAnsi="Times New Roman" w:eastAsia="Aptos" w:cs="Times New Roman"/>
+          <w:b/>
+          <w:bCs/>
+          <w:sz w:val="24"/>
+          <w:szCs w:val="24"/>
           <w:lang w:val="en-US"/>
         </w:rPr>
         <w:t>Vision:</w:t>
       </w:r>
       <w:r>
         <w:rPr>
-          <w:rFonts w:ascii="Aptos" w:hAnsi="Aptos" w:eastAsia="Aptos" w:cs="Aptos"/>
-          <w:sz w:val="22"/>
-          <w:szCs w:val="22"/>
+          <w:rFonts w:hint="default" w:ascii="Times New Roman" w:hAnsi="Times New Roman" w:eastAsia="Aptos" w:cs="Times New Roman"/>
+          <w:sz w:val="24"/>
+          <w:szCs w:val="24"/>
           <w:lang w:val="en-US"/>
         </w:rPr>
         <w:t xml:space="preserve"> To become the premier specialized sanitation partner for the Western Cape’s hospitality and academic infrastructure by 2030.</w:t>
@@ -861,28 +870,28 @@
         <w:spacing w:before="240" w:beforeAutospacing="0" w:after="240" w:afterAutospacing="0"/>
         <w:jc w:val="left"/>
         <w:rPr>
-          <w:rFonts w:ascii="Aptos" w:hAnsi="Aptos" w:eastAsia="Aptos" w:cs="Aptos"/>
-          <w:sz w:val="22"/>
-          <w:szCs w:val="22"/>
-          <w:lang w:val="en-US"/>
-        </w:rPr>
-      </w:pPr>
-      <w:r>
-        <w:rPr>
-          <w:rFonts w:ascii="Aptos" w:hAnsi="Aptos" w:eastAsia="Aptos" w:cs="Aptos"/>
-          <w:b/>
-          <w:bCs/>
-          <w:sz w:val="22"/>
-          <w:szCs w:val="22"/>
+          <w:rFonts w:hint="default" w:ascii="Times New Roman" w:hAnsi="Times New Roman" w:eastAsia="Aptos" w:cs="Times New Roman"/>
+          <w:sz w:val="24"/>
+          <w:szCs w:val="24"/>
+          <w:lang w:val="en-US"/>
+        </w:rPr>
+      </w:pPr>
+      <w:r>
+        <w:rPr>
+          <w:rFonts w:hint="default" w:ascii="Times New Roman" w:hAnsi="Times New Roman" w:eastAsia="Aptos" w:cs="Times New Roman"/>
+          <w:b/>
+          <w:bCs/>
+          <w:sz w:val="24"/>
+          <w:szCs w:val="24"/>
           <w:lang w:val="en-US"/>
         </w:rPr>
         <w:t>Target Audience:</w:t>
       </w:r>
       <w:r>
         <w:rPr>
-          <w:rFonts w:ascii="Aptos" w:hAnsi="Aptos" w:eastAsia="Aptos" w:cs="Aptos"/>
-          <w:sz w:val="22"/>
-          <w:szCs w:val="22"/>
+          <w:rFonts w:hint="default" w:ascii="Times New Roman" w:hAnsi="Times New Roman" w:eastAsia="Aptos" w:cs="Times New Roman"/>
+          <w:sz w:val="24"/>
+          <w:szCs w:val="24"/>
           <w:lang w:val="en-US"/>
         </w:rPr>
         <w:t xml:space="preserve"> Facility managers of guest houses, school administrators, and corporate office coordinators.</w:t>
@@ -906,21 +915,21 @@
         <w:spacing w:before="0" w:beforeAutospacing="0" w:after="281" w:afterAutospacing="0"/>
         <w:jc w:val="left"/>
         <w:rPr>
-          <w:rFonts w:ascii="Aptos" w:hAnsi="Aptos" w:eastAsia="Aptos" w:cs="Aptos"/>
-          <w:b/>
-          <w:bCs/>
-          <w:sz w:val="22"/>
-          <w:szCs w:val="22"/>
-          <w:lang w:val="en-US"/>
-        </w:rPr>
-      </w:pPr>
-      <w:r>
-        <w:rPr>
-          <w:rFonts w:ascii="Aptos" w:hAnsi="Aptos" w:eastAsia="Aptos" w:cs="Aptos"/>
-          <w:b/>
-          <w:bCs/>
-          <w:sz w:val="22"/>
-          <w:szCs w:val="22"/>
+          <w:rFonts w:hint="default" w:ascii="Times New Roman" w:hAnsi="Times New Roman" w:eastAsia="Aptos" w:cs="Times New Roman"/>
+          <w:b/>
+          <w:bCs/>
+          <w:sz w:val="24"/>
+          <w:szCs w:val="24"/>
+          <w:lang w:val="en-US"/>
+        </w:rPr>
+      </w:pPr>
+      <w:r>
+        <w:rPr>
+          <w:rFonts w:hint="default" w:ascii="Times New Roman" w:hAnsi="Times New Roman" w:eastAsia="Aptos" w:cs="Times New Roman"/>
+          <w:b/>
+          <w:bCs/>
+          <w:sz w:val="24"/>
+          <w:szCs w:val="24"/>
           <w:lang w:val="en-US"/>
         </w:rPr>
         <w:t>2. WEBSITE GOALS AND OBJECTIVES</w:t>
@@ -931,17 +940,17 @@
         <w:spacing w:before="0" w:beforeAutospacing="0" w:after="240" w:afterAutospacing="0"/>
         <w:jc w:val="left"/>
         <w:rPr>
-          <w:rFonts w:ascii="Aptos" w:hAnsi="Aptos" w:eastAsia="Aptos" w:cs="Aptos"/>
-          <w:sz w:val="22"/>
-          <w:szCs w:val="22"/>
-          <w:lang w:val="en-US"/>
-        </w:rPr>
-      </w:pPr>
-      <w:r>
-        <w:rPr>
-          <w:rFonts w:ascii="Aptos" w:hAnsi="Aptos" w:eastAsia="Aptos" w:cs="Aptos"/>
-          <w:sz w:val="22"/>
-          <w:szCs w:val="22"/>
+          <w:rFonts w:hint="default" w:ascii="Times New Roman" w:hAnsi="Times New Roman" w:eastAsia="Aptos" w:cs="Times New Roman"/>
+          <w:sz w:val="24"/>
+          <w:szCs w:val="24"/>
+          <w:lang w:val="en-US"/>
+        </w:rPr>
+      </w:pPr>
+      <w:r>
+        <w:rPr>
+          <w:rFonts w:hint="default" w:ascii="Times New Roman" w:hAnsi="Times New Roman" w:eastAsia="Aptos" w:cs="Times New Roman"/>
+          <w:sz w:val="24"/>
+          <w:szCs w:val="24"/>
           <w:lang w:val="en-US"/>
         </w:rPr>
         <w:t>The primary goal is to transition the business from a word of mouth operation to a digitally driven B2B service provider.</w:t>
@@ -957,28 +966,28 @@
         <w:spacing w:before="240" w:beforeAutospacing="0" w:after="240" w:afterAutospacing="0"/>
         <w:jc w:val="left"/>
         <w:rPr>
-          <w:rFonts w:ascii="Aptos" w:hAnsi="Aptos" w:eastAsia="Aptos" w:cs="Aptos"/>
-          <w:sz w:val="22"/>
-          <w:szCs w:val="22"/>
-          <w:lang w:val="en-US"/>
-        </w:rPr>
-      </w:pPr>
-      <w:r>
-        <w:rPr>
-          <w:rFonts w:ascii="Aptos" w:hAnsi="Aptos" w:eastAsia="Aptos" w:cs="Aptos"/>
-          <w:b/>
-          <w:bCs/>
-          <w:sz w:val="22"/>
-          <w:szCs w:val="22"/>
+          <w:rFonts w:hint="default" w:ascii="Times New Roman" w:hAnsi="Times New Roman" w:eastAsia="Aptos" w:cs="Times New Roman"/>
+          <w:sz w:val="24"/>
+          <w:szCs w:val="24"/>
+          <w:lang w:val="en-US"/>
+        </w:rPr>
+      </w:pPr>
+      <w:r>
+        <w:rPr>
+          <w:rFonts w:hint="default" w:ascii="Times New Roman" w:hAnsi="Times New Roman" w:eastAsia="Aptos" w:cs="Times New Roman"/>
+          <w:b/>
+          <w:bCs/>
+          <w:sz w:val="24"/>
+          <w:szCs w:val="24"/>
           <w:lang w:val="en-US"/>
         </w:rPr>
         <w:t>Objective 1:</w:t>
       </w:r>
       <w:r>
         <w:rPr>
-          <w:rFonts w:ascii="Aptos" w:hAnsi="Aptos" w:eastAsia="Aptos" w:cs="Aptos"/>
-          <w:sz w:val="22"/>
-          <w:szCs w:val="22"/>
+          <w:rFonts w:hint="default" w:ascii="Times New Roman" w:hAnsi="Times New Roman" w:eastAsia="Aptos" w:cs="Times New Roman"/>
+          <w:sz w:val="24"/>
+          <w:szCs w:val="24"/>
           <w:lang w:val="en-US"/>
         </w:rPr>
         <w:t xml:space="preserve"> Generate 20 high value leads per month through a streamlined Request a Quote interface.</w:t>
@@ -994,28 +1003,28 @@
         <w:spacing w:before="240" w:beforeAutospacing="0" w:after="240" w:afterAutospacing="0"/>
         <w:jc w:val="left"/>
         <w:rPr>
-          <w:rFonts w:ascii="Aptos" w:hAnsi="Aptos" w:eastAsia="Aptos" w:cs="Aptos"/>
-          <w:sz w:val="22"/>
-          <w:szCs w:val="22"/>
-          <w:lang w:val="en-US"/>
-        </w:rPr>
-      </w:pPr>
-      <w:r>
-        <w:rPr>
-          <w:rFonts w:ascii="Aptos" w:hAnsi="Aptos" w:eastAsia="Aptos" w:cs="Aptos"/>
-          <w:b/>
-          <w:bCs/>
-          <w:sz w:val="22"/>
-          <w:szCs w:val="22"/>
+          <w:rFonts w:hint="default" w:ascii="Times New Roman" w:hAnsi="Times New Roman" w:eastAsia="Aptos" w:cs="Times New Roman"/>
+          <w:sz w:val="24"/>
+          <w:szCs w:val="24"/>
+          <w:lang w:val="en-US"/>
+        </w:rPr>
+      </w:pPr>
+      <w:r>
+        <w:rPr>
+          <w:rFonts w:hint="default" w:ascii="Times New Roman" w:hAnsi="Times New Roman" w:eastAsia="Aptos" w:cs="Times New Roman"/>
+          <w:b/>
+          <w:bCs/>
+          <w:sz w:val="24"/>
+          <w:szCs w:val="24"/>
           <w:lang w:val="en-US"/>
         </w:rPr>
         <w:t>Objective 2:</w:t>
       </w:r>
       <w:r>
         <w:rPr>
-          <w:rFonts w:ascii="Aptos" w:hAnsi="Aptos" w:eastAsia="Aptos" w:cs="Aptos"/>
-          <w:sz w:val="22"/>
-          <w:szCs w:val="22"/>
+          <w:rFonts w:hint="default" w:ascii="Times New Roman" w:hAnsi="Times New Roman" w:eastAsia="Aptos" w:cs="Times New Roman"/>
+          <w:sz w:val="24"/>
+          <w:szCs w:val="24"/>
           <w:lang w:val="en-US"/>
         </w:rPr>
         <w:t xml:space="preserve"> Establish technical authority by hosting educational content regarding deep extraction vs standard maintenance.</w:t>
@@ -1031,49 +1040,73 @@
         <w:spacing w:before="240" w:beforeAutospacing="0" w:after="240" w:afterAutospacing="0"/>
         <w:jc w:val="left"/>
         <w:rPr>
-          <w:rFonts w:ascii="Aptos" w:hAnsi="Aptos" w:eastAsia="Aptos" w:cs="Aptos"/>
-          <w:sz w:val="22"/>
-          <w:szCs w:val="22"/>
-          <w:lang w:val="en-US"/>
-        </w:rPr>
-      </w:pPr>
-      <w:r>
-        <w:rPr>
-          <w:rFonts w:ascii="Aptos" w:hAnsi="Aptos" w:eastAsia="Aptos" w:cs="Aptos"/>
-          <w:b/>
-          <w:bCs/>
-          <w:sz w:val="22"/>
-          <w:szCs w:val="22"/>
+          <w:rFonts w:hint="default" w:ascii="Times New Roman" w:hAnsi="Times New Roman" w:eastAsia="Aptos" w:cs="Times New Roman"/>
+          <w:sz w:val="24"/>
+          <w:szCs w:val="24"/>
+          <w:lang w:val="en-US"/>
+        </w:rPr>
+      </w:pPr>
+      <w:r>
+        <w:rPr>
+          <w:rFonts w:hint="default" w:ascii="Times New Roman" w:hAnsi="Times New Roman" w:eastAsia="Aptos" w:cs="Times New Roman"/>
+          <w:b/>
+          <w:bCs/>
+          <w:sz w:val="24"/>
+          <w:szCs w:val="24"/>
           <w:lang w:val="en-US"/>
         </w:rPr>
         <w:t>KPIs:</w:t>
       </w:r>
       <w:r>
         <w:rPr>
-          <w:rFonts w:ascii="Aptos" w:hAnsi="Aptos" w:eastAsia="Aptos" w:cs="Aptos"/>
-          <w:sz w:val="22"/>
-          <w:szCs w:val="22"/>
-          <w:lang w:val="en-US"/>
-        </w:rPr>
-        <w:t xml:space="preserve"> 1. A conversion rate of 5% on the primary Call to Action (CTA) buttons.</w:t>
-      </w:r>
-    </w:p>
-    <w:p>
-      <w:pPr>
+          <w:rFonts w:hint="default" w:ascii="Times New Roman" w:hAnsi="Times New Roman" w:eastAsia="Aptos" w:cs="Times New Roman"/>
+          <w:sz w:val="24"/>
+          <w:szCs w:val="24"/>
+          <w:lang w:val="en-US"/>
+        </w:rPr>
+        <w:t xml:space="preserve"> 1. A conversion rate of 5% on the primary Call to Action (CTA) </w:t>
+      </w:r>
+      <w:r>
+        <w:rPr>
+          <w:rFonts w:hint="default" w:ascii="Times New Roman" w:hAnsi="Times New Roman" w:eastAsia="Aptos" w:cs="Times New Roman"/>
+          <w:sz w:val="24"/>
+          <w:szCs w:val="24"/>
+          <w:lang w:val="en-ZA"/>
+        </w:rPr>
+        <w:tab/>
+      </w:r>
+      <w:r>
+        <w:rPr>
+          <w:rFonts w:hint="default" w:ascii="Times New Roman" w:hAnsi="Times New Roman" w:eastAsia="Aptos" w:cs="Times New Roman"/>
+          <w:sz w:val="24"/>
+          <w:szCs w:val="24"/>
+          <w:lang w:val="en-US"/>
+        </w:rPr>
+        <w:t>buttons.</w:t>
+      </w:r>
+    </w:p>
+    <w:p>
+      <w:pPr>
+        <w:pStyle w:val="7"/>
+        <w:numPr>
+          <w:ilvl w:val="1"/>
+          <w:numId w:val="3"/>
+        </w:numPr>
         <w:spacing w:before="240" w:beforeAutospacing="0" w:after="240" w:afterAutospacing="0"/>
-        <w:jc w:val="left"/>
-        <w:rPr>
-          <w:rFonts w:ascii="Aptos" w:hAnsi="Aptos" w:eastAsia="Aptos" w:cs="Aptos"/>
-          <w:sz w:val="22"/>
-          <w:szCs w:val="22"/>
-          <w:lang w:val="en-US"/>
-        </w:rPr>
-      </w:pPr>
-      <w:r>
-        <w:rPr>
-          <w:rFonts w:ascii="Aptos" w:hAnsi="Aptos" w:eastAsia="Aptos" w:cs="Aptos"/>
-          <w:sz w:val="22"/>
-          <w:szCs w:val="22"/>
+        <w:ind w:left="1440" w:leftChars="0" w:hanging="360" w:firstLineChars="0"/>
+        <w:jc w:val="left"/>
+        <w:rPr>
+          <w:rFonts w:hint="default" w:ascii="Times New Roman" w:hAnsi="Times New Roman" w:eastAsia="Aptos" w:cs="Times New Roman"/>
+          <w:sz w:val="24"/>
+          <w:szCs w:val="24"/>
+          <w:lang w:val="en-US"/>
+        </w:rPr>
+      </w:pPr>
+      <w:r>
+        <w:rPr>
+          <w:rFonts w:hint="default" w:ascii="Times New Roman" w:hAnsi="Times New Roman" w:eastAsia="Aptos" w:cs="Times New Roman"/>
+          <w:sz w:val="24"/>
+          <w:szCs w:val="24"/>
           <w:lang w:val="en-US"/>
         </w:rPr>
         <w:t>2. Reduction in manual inquiry time by 30% through the use of an automated FAQ and interactive form.</w:t>
@@ -1103,6 +1136,301 @@
           <w:lang w:val="en-US"/>
         </w:rPr>
         <w:t>3. PROPOSED WEBSITE FEATURES AND FUNCTIONALITY</w:t>
+      </w:r>
+    </w:p>
+    <w:p>
+      <w:pPr>
+        <w:pStyle w:val="2"/>
+        <w:spacing w:before="281" w:beforeAutospacing="0" w:after="281" w:afterAutospacing="0"/>
+        <w:rPr>
+          <w:rFonts w:hint="default" w:asciiTheme="minorAscii" w:hAnsiTheme="minorAscii"/>
+          <w:sz w:val="22"/>
+          <w:szCs w:val="22"/>
+        </w:rPr>
+      </w:pPr>
+      <w:r>
+        <w:rPr>
+          <w:rFonts w:hint="default" w:eastAsia="Aptos" w:cs="Aptos" w:asciiTheme="minorAscii" w:hAnsiTheme="minorAscii"/>
+          <w:b/>
+          <w:bCs/>
+          <w:sz w:val="22"/>
+          <w:szCs w:val="22"/>
+          <w:lang w:val="en-US"/>
+        </w:rPr>
+        <w:t>Homepage (index.html)</w:t>
+      </w:r>
+    </w:p>
+    <w:p>
+      <w:pPr>
+        <w:spacing w:before="240" w:beforeAutospacing="0" w:after="240" w:afterAutospacing="0"/>
+        <w:rPr>
+          <w:rFonts w:hint="default" w:asciiTheme="minorAscii" w:hAnsiTheme="minorAscii"/>
+          <w:sz w:val="22"/>
+          <w:szCs w:val="22"/>
+        </w:rPr>
+      </w:pPr>
+      <w:r>
+        <w:rPr>
+          <w:rFonts w:hint="default" w:eastAsia="Aptos" w:cs="Aptos" w:asciiTheme="minorAscii" w:hAnsiTheme="minorAscii"/>
+          <w:sz w:val="22"/>
+          <w:szCs w:val="22"/>
+          <w:lang w:val="en-US"/>
+        </w:rPr>
+        <w:t>The homepage is the first page users will see. It includes a hero image, a brief introduction to the business, a navigation menu, and a call-to-action button that directs users to the booking page.</w:t>
+      </w:r>
+    </w:p>
+    <w:p>
+      <w:pPr>
+        <w:pStyle w:val="2"/>
+        <w:spacing w:before="281" w:beforeAutospacing="0" w:after="281" w:afterAutospacing="0"/>
+        <w:rPr>
+          <w:rFonts w:hint="default" w:asciiTheme="minorAscii" w:hAnsiTheme="minorAscii"/>
+          <w:sz w:val="22"/>
+          <w:szCs w:val="22"/>
+        </w:rPr>
+      </w:pPr>
+      <w:r>
+        <w:rPr>
+          <w:rFonts w:hint="default" w:eastAsia="Aptos" w:cs="Aptos" w:asciiTheme="minorAscii" w:hAnsiTheme="minorAscii"/>
+          <w:b/>
+          <w:bCs/>
+          <w:sz w:val="22"/>
+          <w:szCs w:val="22"/>
+          <w:lang w:val="en-US"/>
+        </w:rPr>
+        <w:t xml:space="preserve"> About Us (about.html)</w:t>
+      </w:r>
+    </w:p>
+    <w:p>
+      <w:pPr>
+        <w:spacing w:before="240" w:beforeAutospacing="0" w:after="240" w:afterAutospacing="0"/>
+        <w:rPr>
+          <w:rFonts w:hint="default" w:asciiTheme="minorAscii" w:hAnsiTheme="minorAscii"/>
+          <w:sz w:val="22"/>
+          <w:szCs w:val="22"/>
+        </w:rPr>
+      </w:pPr>
+      <w:r>
+        <w:rPr>
+          <w:rFonts w:hint="default" w:eastAsia="Aptos" w:cs="Aptos" w:asciiTheme="minorAscii" w:hAnsiTheme="minorAscii"/>
+          <w:sz w:val="22"/>
+          <w:szCs w:val="22"/>
+          <w:lang w:val="en-US"/>
+        </w:rPr>
+        <w:t xml:space="preserve">This page provides information about the </w:t>
+      </w:r>
+      <w:r>
+        <w:rPr>
+          <w:rFonts w:hint="default" w:eastAsia="Aptos" w:cs="Aptos" w:asciiTheme="minorAscii" w:hAnsiTheme="minorAscii"/>
+          <w:sz w:val="22"/>
+          <w:szCs w:val="22"/>
+          <w:lang w:val="en-ZA"/>
+        </w:rPr>
+        <w:t>organization</w:t>
+      </w:r>
+      <w:r>
+        <w:rPr>
+          <w:rFonts w:hint="default" w:eastAsia="Aptos" w:cs="Aptos" w:asciiTheme="minorAscii" w:hAnsiTheme="minorAscii"/>
+          <w:sz w:val="22"/>
+          <w:szCs w:val="22"/>
+          <w:lang w:val="en-US"/>
+        </w:rPr>
+        <w:t>, including its background, mission, and vision. It helps build trust with potential customers.</w:t>
+      </w:r>
+    </w:p>
+    <w:p>
+      <w:pPr>
+        <w:rPr>
+          <w:rFonts w:hint="default" w:asciiTheme="minorAscii" w:hAnsiTheme="minorAscii"/>
+          <w:sz w:val="22"/>
+          <w:szCs w:val="22"/>
+        </w:rPr>
+      </w:pPr>
+    </w:p>
+    <w:p>
+      <w:pPr>
+        <w:pStyle w:val="2"/>
+        <w:spacing w:before="281" w:beforeAutospacing="0" w:after="281" w:afterAutospacing="0"/>
+        <w:rPr>
+          <w:rFonts w:hint="default" w:asciiTheme="minorAscii" w:hAnsiTheme="minorAscii"/>
+          <w:sz w:val="22"/>
+          <w:szCs w:val="22"/>
+        </w:rPr>
+      </w:pPr>
+      <w:r>
+        <w:rPr>
+          <w:rFonts w:hint="default" w:eastAsia="Aptos" w:cs="Aptos" w:asciiTheme="minorAscii" w:hAnsiTheme="minorAscii"/>
+          <w:b/>
+          <w:bCs/>
+          <w:sz w:val="22"/>
+          <w:szCs w:val="22"/>
+          <w:lang w:val="en-US"/>
+        </w:rPr>
+        <w:t>Services (services.html)</w:t>
+      </w:r>
+    </w:p>
+    <w:p>
+      <w:pPr>
+        <w:spacing w:before="240" w:beforeAutospacing="0" w:after="240" w:afterAutospacing="0"/>
+        <w:rPr>
+          <w:rFonts w:hint="default" w:asciiTheme="minorAscii" w:hAnsiTheme="minorAscii"/>
+          <w:sz w:val="22"/>
+          <w:szCs w:val="22"/>
+        </w:rPr>
+      </w:pPr>
+      <w:r>
+        <w:rPr>
+          <w:rFonts w:hint="default" w:eastAsia="Aptos" w:cs="Aptos" w:asciiTheme="minorAscii" w:hAnsiTheme="minorAscii"/>
+          <w:sz w:val="22"/>
+          <w:szCs w:val="22"/>
+          <w:lang w:val="en-US"/>
+        </w:rPr>
+        <w:t xml:space="preserve">The services page outlines the different car cleaning services offered, such as exterior washing, interior </w:t>
+      </w:r>
+      <w:bookmarkStart w:id="0" w:name="_GoBack"/>
+      <w:bookmarkEnd w:id="0"/>
+      <w:r>
+        <w:rPr>
+          <w:rFonts w:hint="default" w:eastAsia="Aptos" w:cs="Aptos" w:asciiTheme="minorAscii" w:hAnsiTheme="minorAscii"/>
+          <w:sz w:val="22"/>
+          <w:szCs w:val="22"/>
+          <w:lang w:val="en-US"/>
+        </w:rPr>
+        <w:t>cleaning, and full detailing. It also includes pricing information.</w:t>
+      </w:r>
+    </w:p>
+    <w:p>
+      <w:pPr>
+        <w:rPr>
+          <w:rFonts w:hint="default" w:asciiTheme="minorAscii" w:hAnsiTheme="minorAscii"/>
+          <w:sz w:val="22"/>
+          <w:szCs w:val="22"/>
+        </w:rPr>
+      </w:pPr>
+    </w:p>
+    <w:p>
+      <w:pPr>
+        <w:pStyle w:val="2"/>
+        <w:spacing w:before="281" w:beforeAutospacing="0" w:after="281" w:afterAutospacing="0"/>
+        <w:rPr>
+          <w:rFonts w:hint="default" w:asciiTheme="minorAscii" w:hAnsiTheme="minorAscii"/>
+          <w:sz w:val="22"/>
+          <w:szCs w:val="22"/>
+        </w:rPr>
+      </w:pPr>
+      <w:r>
+        <w:rPr>
+          <w:rFonts w:hint="default" w:eastAsia="Aptos" w:cs="Aptos" w:asciiTheme="minorAscii" w:hAnsiTheme="minorAscii"/>
+          <w:b/>
+          <w:bCs/>
+          <w:sz w:val="22"/>
+          <w:szCs w:val="22"/>
+          <w:lang w:val="en-US"/>
+        </w:rPr>
+        <w:t>Book Now (booking.html)</w:t>
+      </w:r>
+    </w:p>
+    <w:p>
+      <w:pPr>
+        <w:spacing w:before="240" w:beforeAutospacing="0" w:after="240" w:afterAutospacing="0"/>
+        <w:rPr>
+          <w:rFonts w:hint="default" w:asciiTheme="minorAscii" w:hAnsiTheme="minorAscii"/>
+          <w:sz w:val="22"/>
+          <w:szCs w:val="22"/>
+        </w:rPr>
+      </w:pPr>
+      <w:r>
+        <w:rPr>
+          <w:rFonts w:hint="default" w:eastAsia="Aptos" w:cs="Aptos" w:asciiTheme="minorAscii" w:hAnsiTheme="minorAscii"/>
+          <w:sz w:val="22"/>
+          <w:szCs w:val="22"/>
+          <w:lang w:val="en-US"/>
+        </w:rPr>
+        <w:t>The booking page allows customers to schedule a car wash service. It includes a form where users can enter their details, select a service, and choose a preferred date.</w:t>
+      </w:r>
+    </w:p>
+    <w:p>
+      <w:pPr>
+        <w:rPr>
+          <w:rFonts w:hint="default" w:asciiTheme="minorAscii" w:hAnsiTheme="minorAscii"/>
+          <w:sz w:val="22"/>
+          <w:szCs w:val="22"/>
+        </w:rPr>
+      </w:pPr>
+    </w:p>
+    <w:p>
+      <w:pPr>
+        <w:pStyle w:val="2"/>
+        <w:spacing w:before="281" w:beforeAutospacing="0" w:after="281" w:afterAutospacing="0"/>
+        <w:rPr>
+          <w:rFonts w:hint="default" w:asciiTheme="minorAscii" w:hAnsiTheme="minorAscii"/>
+          <w:sz w:val="22"/>
+          <w:szCs w:val="22"/>
+        </w:rPr>
+      </w:pPr>
+      <w:r>
+        <w:rPr>
+          <w:rFonts w:hint="default" w:eastAsia="Aptos" w:cs="Aptos" w:asciiTheme="minorAscii" w:hAnsiTheme="minorAscii"/>
+          <w:b/>
+          <w:bCs/>
+          <w:sz w:val="22"/>
+          <w:szCs w:val="22"/>
+          <w:lang w:val="en-US"/>
+        </w:rPr>
+        <w:t xml:space="preserve"> Contact (contact.html)</w:t>
+      </w:r>
+    </w:p>
+    <w:p>
+      <w:pPr>
+        <w:spacing w:before="240" w:beforeAutospacing="0" w:after="240" w:afterAutospacing="0"/>
+        <w:rPr>
+          <w:rFonts w:hint="default" w:asciiTheme="minorAscii" w:hAnsiTheme="minorAscii"/>
+          <w:sz w:val="22"/>
+          <w:szCs w:val="22"/>
+        </w:rPr>
+      </w:pPr>
+      <w:r>
+        <w:rPr>
+          <w:rFonts w:hint="default" w:eastAsia="Aptos" w:cs="Aptos" w:asciiTheme="minorAscii" w:hAnsiTheme="minorAscii"/>
+          <w:sz w:val="22"/>
+          <w:szCs w:val="22"/>
+          <w:lang w:val="en-US"/>
+        </w:rPr>
+        <w:t>The contact page provides important contact details such as phone number, email, and physical locations. It includes at least two locations to meet assignment requirements.</w:t>
+      </w:r>
+    </w:p>
+    <w:p>
+      <w:pPr>
+        <w:rPr>
+          <w:rFonts w:hint="default" w:eastAsia="Aptos" w:cs="Aptos" w:asciiTheme="minorAscii" w:hAnsiTheme="minorAscii"/>
+          <w:sz w:val="22"/>
+          <w:szCs w:val="22"/>
+          <w:lang w:val="en-US"/>
+        </w:rPr>
+      </w:pPr>
+    </w:p>
+    <w:p>
+      <w:pPr>
+        <w:spacing w:before="281" w:beforeAutospacing="0" w:after="281" w:afterAutospacing="0"/>
+        <w:rPr>
+          <w:rFonts w:ascii="Aptos" w:hAnsi="Aptos" w:eastAsia="Aptos" w:cs="Aptos"/>
+          <w:b/>
+          <w:bCs/>
+          <w:sz w:val="22"/>
+          <w:szCs w:val="22"/>
+          <w:lang w:val="en-US"/>
+        </w:rPr>
+      </w:pPr>
+      <w:r>
+        <w:rPr>
+          <w:rFonts w:ascii="Aptos" w:hAnsi="Aptos" w:eastAsia="Aptos" w:cs="Aptos"/>
+          <w:b/>
+          <w:bCs/>
+          <w:sz w:val="22"/>
+          <w:szCs w:val="22"/>
+          <w:lang w:val="en-US"/>
+        </w:rPr>
+        <w:t>4. DESIGN AND USER EXPERIENCE</w:t>
       </w:r>
     </w:p>
     <w:p>
@@ -1113,191 +1441,6 @@
           <w:numId w:val="4"/>
         </w:numPr>
         <w:spacing w:before="240" w:beforeAutospacing="0" w:after="240" w:afterAutospacing="0"/>
-        <w:jc w:val="left"/>
-        <w:rPr>
-          <w:rFonts w:ascii="Aptos" w:hAnsi="Aptos" w:eastAsia="Aptos" w:cs="Aptos"/>
-          <w:sz w:val="22"/>
-          <w:szCs w:val="22"/>
-          <w:lang w:val="en-US"/>
-        </w:rPr>
-      </w:pPr>
-      <w:r>
-        <w:rPr>
-          <w:rFonts w:ascii="Aptos" w:hAnsi="Aptos" w:eastAsia="Aptos" w:cs="Aptos"/>
-          <w:b/>
-          <w:bCs/>
-          <w:sz w:val="22"/>
-          <w:szCs w:val="22"/>
-          <w:lang w:val="en-US"/>
-        </w:rPr>
-        <w:t>Interactive Quote Estimator:</w:t>
-      </w:r>
-      <w:r>
-        <w:rPr>
-          <w:rFonts w:ascii="Aptos" w:hAnsi="Aptos" w:eastAsia="Aptos" w:cs="Aptos"/>
-          <w:sz w:val="22"/>
-          <w:szCs w:val="22"/>
-          <w:lang w:val="en-US"/>
-        </w:rPr>
-        <w:t xml:space="preserve"> A JavaScript-powered tool allowing users to select room types and receive a ballpark estimate.</w:t>
-      </w:r>
-    </w:p>
-    <w:p>
-      <w:pPr>
-        <w:pStyle w:val="7"/>
-        <w:numPr>
-          <w:ilvl w:val="0"/>
-          <w:numId w:val="4"/>
-        </w:numPr>
-        <w:spacing w:before="240" w:beforeAutospacing="0" w:after="240" w:afterAutospacing="0"/>
-        <w:jc w:val="left"/>
-        <w:rPr>
-          <w:rFonts w:ascii="Aptos" w:hAnsi="Aptos" w:eastAsia="Aptos" w:cs="Aptos"/>
-          <w:sz w:val="22"/>
-          <w:szCs w:val="22"/>
-          <w:lang w:val="en-US"/>
-        </w:rPr>
-      </w:pPr>
-      <w:r>
-        <w:rPr>
-          <w:rFonts w:ascii="Aptos" w:hAnsi="Aptos" w:eastAsia="Aptos" w:cs="Aptos"/>
-          <w:b/>
-          <w:bCs/>
-          <w:sz w:val="22"/>
-          <w:szCs w:val="22"/>
-          <w:lang w:val="en-US"/>
-        </w:rPr>
-        <w:t>Service Transformation Gallery:</w:t>
-      </w:r>
-      <w:r>
-        <w:rPr>
-          <w:rFonts w:ascii="Aptos" w:hAnsi="Aptos" w:eastAsia="Aptos" w:cs="Aptos"/>
-          <w:sz w:val="22"/>
-          <w:szCs w:val="22"/>
-          <w:lang w:val="en-US"/>
-        </w:rPr>
-        <w:t xml:space="preserve"> A "Before &amp; After" high-resolution slider to visually demonstrate efficacy.</w:t>
-      </w:r>
-    </w:p>
-    <w:p>
-      <w:pPr>
-        <w:pStyle w:val="7"/>
-        <w:numPr>
-          <w:ilvl w:val="0"/>
-          <w:numId w:val="4"/>
-        </w:numPr>
-        <w:spacing w:before="240" w:beforeAutospacing="0" w:after="240" w:afterAutospacing="0"/>
-        <w:jc w:val="left"/>
-        <w:rPr>
-          <w:rFonts w:ascii="Aptos" w:hAnsi="Aptos" w:eastAsia="Aptos" w:cs="Aptos"/>
-          <w:sz w:val="22"/>
-          <w:szCs w:val="22"/>
-          <w:lang w:val="en-US"/>
-        </w:rPr>
-      </w:pPr>
-      <w:r>
-        <w:rPr>
-          <w:rFonts w:ascii="Aptos" w:hAnsi="Aptos" w:eastAsia="Aptos" w:cs="Aptos"/>
-          <w:b/>
-          <w:bCs/>
-          <w:sz w:val="22"/>
-          <w:szCs w:val="22"/>
-          <w:lang w:val="en-US"/>
-        </w:rPr>
-        <w:t>WhatsApp Business Integration:</w:t>
-      </w:r>
-      <w:r>
-        <w:rPr>
-          <w:rFonts w:ascii="Aptos" w:hAnsi="Aptos" w:eastAsia="Aptos" w:cs="Aptos"/>
-          <w:sz w:val="22"/>
-          <w:szCs w:val="22"/>
-          <w:lang w:val="en-US"/>
-        </w:rPr>
-        <w:t xml:space="preserve"> A floating API button for real-time consultation, crucial for the South African mobile-first market.</w:t>
-      </w:r>
-    </w:p>
-    <w:p>
-      <w:pPr>
-        <w:pStyle w:val="7"/>
-        <w:numPr>
-          <w:ilvl w:val="0"/>
-          <w:numId w:val="4"/>
-        </w:numPr>
-        <w:spacing w:before="240" w:beforeAutospacing="0" w:after="240" w:afterAutospacing="0"/>
-        <w:jc w:val="left"/>
-        <w:rPr>
-          <w:rFonts w:ascii="Aptos" w:hAnsi="Aptos" w:eastAsia="Aptos" w:cs="Aptos"/>
-          <w:sz w:val="22"/>
-          <w:szCs w:val="22"/>
-          <w:lang w:val="en-US"/>
-        </w:rPr>
-      </w:pPr>
-      <w:r>
-        <w:rPr>
-          <w:rFonts w:ascii="Aptos" w:hAnsi="Aptos" w:eastAsia="Aptos" w:cs="Aptos"/>
-          <w:b/>
-          <w:bCs/>
-          <w:sz w:val="22"/>
-          <w:szCs w:val="22"/>
-          <w:lang w:val="en-US"/>
-        </w:rPr>
-        <w:t>Responsive Navigation:</w:t>
-      </w:r>
-      <w:r>
-        <w:rPr>
-          <w:rFonts w:ascii="Aptos" w:hAnsi="Aptos" w:eastAsia="Aptos" w:cs="Aptos"/>
-          <w:sz w:val="22"/>
-          <w:szCs w:val="22"/>
-          <w:lang w:val="en-US"/>
-        </w:rPr>
-        <w:t xml:space="preserve"> A mobile-optimized menu ensuring facility managers can book services while on-site.</w:t>
-      </w:r>
-    </w:p>
-    <w:p>
-      <w:pPr>
-        <w:spacing w:before="281" w:beforeAutospacing="0" w:after="281" w:afterAutospacing="0"/>
-        <w:rPr>
-          <w:rFonts w:ascii="Aptos" w:hAnsi="Aptos" w:eastAsia="Aptos" w:cs="Aptos"/>
-          <w:b/>
-          <w:bCs/>
-          <w:sz w:val="22"/>
-          <w:szCs w:val="22"/>
-          <w:lang w:val="en-US"/>
-        </w:rPr>
-      </w:pPr>
-    </w:p>
-    <w:p>
-      <w:pPr>
-        <w:spacing w:before="281" w:beforeAutospacing="0" w:after="281" w:afterAutospacing="0"/>
-        <w:rPr>
-          <w:rFonts w:ascii="Aptos" w:hAnsi="Aptos" w:eastAsia="Aptos" w:cs="Aptos"/>
-          <w:b/>
-          <w:bCs/>
-          <w:sz w:val="22"/>
-          <w:szCs w:val="22"/>
-          <w:lang w:val="en-US"/>
-        </w:rPr>
-      </w:pPr>
-      <w:r>
-        <w:rPr>
-          <w:rFonts w:ascii="Aptos" w:hAnsi="Aptos" w:eastAsia="Aptos" w:cs="Aptos"/>
-          <w:b/>
-          <w:bCs/>
-          <w:sz w:val="22"/>
-          <w:szCs w:val="22"/>
-          <w:lang w:val="en-US"/>
-        </w:rPr>
-        <w:t>4. DESIGN AND USER EXPERIENCE</w:t>
-      </w:r>
-    </w:p>
-    <w:p>
-      <w:pPr>
-        <w:pStyle w:val="7"/>
-        <w:numPr>
-          <w:ilvl w:val="0"/>
-          <w:numId w:val="5"/>
-        </w:numPr>
-        <w:spacing w:before="240" w:beforeAutospacing="0" w:after="240" w:afterAutospacing="0"/>
         <w:rPr>
           <w:rFonts w:ascii="Aptos" w:hAnsi="Aptos" w:eastAsia="Aptos" w:cs="Aptos"/>
           <w:b/>
@@ -1368,62 +1511,6 @@
         <w:ind w:left="720"/>
         <w:rPr>
           <w:rFonts w:ascii="Aptos" w:hAnsi="Aptos" w:eastAsia="Aptos" w:cs="Aptos"/>
-          <w:sz w:val="22"/>
-          <w:szCs w:val="22"/>
-          <w:lang w:val="en-US"/>
-        </w:rPr>
-      </w:pPr>
-    </w:p>
-    <w:p>
-      <w:pPr>
-        <w:spacing w:before="240" w:beforeAutospacing="0" w:after="240" w:afterAutospacing="0"/>
-        <w:ind w:left="720"/>
-        <w:rPr>
-          <w:rFonts w:ascii="Aptos" w:hAnsi="Aptos" w:eastAsia="Aptos" w:cs="Aptos"/>
-          <w:b/>
-          <w:bCs/>
-          <w:sz w:val="22"/>
-          <w:szCs w:val="22"/>
-          <w:lang w:val="en-US"/>
-        </w:rPr>
-      </w:pPr>
-    </w:p>
-    <w:p>
-      <w:pPr>
-        <w:spacing w:before="240" w:beforeAutospacing="0" w:after="240" w:afterAutospacing="0"/>
-        <w:ind w:left="720"/>
-        <w:rPr>
-          <w:rFonts w:ascii="Aptos" w:hAnsi="Aptos" w:eastAsia="Aptos" w:cs="Aptos"/>
-          <w:b/>
-          <w:bCs/>
-          <w:sz w:val="22"/>
-          <w:szCs w:val="22"/>
-          <w:lang w:val="en-US"/>
-        </w:rPr>
-      </w:pPr>
-    </w:p>
-    <w:p>
-      <w:pPr>
-        <w:spacing w:before="240" w:beforeAutospacing="0" w:after="240" w:afterAutospacing="0"/>
-        <w:ind w:left="720"/>
-        <w:rPr>
-          <w:rFonts w:ascii="Aptos" w:hAnsi="Aptos" w:eastAsia="Aptos" w:cs="Aptos"/>
-          <w:b/>
-          <w:bCs/>
-          <w:sz w:val="22"/>
-          <w:szCs w:val="22"/>
-          <w:lang w:val="en-US"/>
-        </w:rPr>
-      </w:pPr>
-    </w:p>
-    <w:p>
-      <w:pPr>
-        <w:spacing w:before="240" w:beforeAutospacing="0" w:after="240" w:afterAutospacing="0"/>
-        <w:ind w:left="720"/>
-        <w:rPr>
-          <w:rFonts w:ascii="Aptos" w:hAnsi="Aptos" w:eastAsia="Aptos" w:cs="Aptos"/>
-          <w:b/>
-          <w:bCs/>
           <w:sz w:val="22"/>
           <w:szCs w:val="22"/>
           <w:lang w:val="en-US"/>
@@ -2324,7 +2411,7 @@
         <w:pStyle w:val="7"/>
         <w:numPr>
           <w:ilvl w:val="0"/>
-          <w:numId w:val="6"/>
+          <w:numId w:val="5"/>
         </w:numPr>
         <w:bidi w:val="0"/>
         <w:spacing w:before="240" w:beforeAutospacing="0" w:after="240" w:afterAutospacing="0"/>
@@ -2355,6 +2442,187 @@
           <w:lang w:val="en-US"/>
         </w:rPr>
         <w:t xml:space="preserve"> R89.00 (Annual)</w:t>
+      </w:r>
+    </w:p>
+    <w:p>
+      <w:pPr>
+        <w:pStyle w:val="7"/>
+        <w:numPr>
+          <w:ilvl w:val="0"/>
+          <w:numId w:val="5"/>
+        </w:numPr>
+        <w:bidi w:val="0"/>
+        <w:spacing w:before="240" w:beforeAutospacing="0" w:after="240" w:afterAutospacing="0"/>
+        <w:jc w:val="left"/>
+        <w:rPr>
+          <w:rFonts w:ascii="Aptos" w:hAnsi="Aptos" w:eastAsia="Aptos" w:cs="Aptos"/>
+          <w:sz w:val="22"/>
+          <w:szCs w:val="22"/>
+          <w:lang w:val="en-US"/>
+        </w:rPr>
+      </w:pPr>
+      <w:r>
+        <w:rPr>
+          <w:rFonts w:ascii="Aptos" w:hAnsi="Aptos" w:eastAsia="Aptos" w:cs="Aptos"/>
+          <w:b/>
+          <w:bCs/>
+          <w:sz w:val="22"/>
+          <w:szCs w:val="22"/>
+          <w:lang w:val="en-US"/>
+        </w:rPr>
+        <w:t>Hosting (Basic):</w:t>
+      </w:r>
+      <w:r>
+        <w:rPr>
+          <w:rFonts w:ascii="Aptos" w:hAnsi="Aptos" w:eastAsia="Aptos" w:cs="Aptos"/>
+          <w:sz w:val="22"/>
+          <w:szCs w:val="22"/>
+          <w:lang w:val="en-US"/>
+        </w:rPr>
+        <w:t xml:space="preserve"> R150.00 (Monthly)</w:t>
+      </w:r>
+    </w:p>
+    <w:p>
+      <w:pPr>
+        <w:pStyle w:val="7"/>
+        <w:numPr>
+          <w:ilvl w:val="0"/>
+          <w:numId w:val="5"/>
+        </w:numPr>
+        <w:bidi w:val="0"/>
+        <w:spacing w:before="240" w:beforeAutospacing="0" w:after="240" w:afterAutospacing="0"/>
+        <w:jc w:val="left"/>
+        <w:rPr>
+          <w:rFonts w:ascii="Aptos" w:hAnsi="Aptos" w:eastAsia="Aptos" w:cs="Aptos"/>
+          <w:sz w:val="22"/>
+          <w:szCs w:val="22"/>
+          <w:lang w:val="en-US"/>
+        </w:rPr>
+      </w:pPr>
+      <w:r>
+        <w:rPr>
+          <w:rFonts w:ascii="Aptos" w:hAnsi="Aptos" w:eastAsia="Aptos" w:cs="Aptos"/>
+          <w:b/>
+          <w:bCs/>
+          <w:sz w:val="22"/>
+          <w:szCs w:val="22"/>
+          <w:lang w:val="en-US"/>
+        </w:rPr>
+        <w:t>Development:</w:t>
+      </w:r>
+      <w:r>
+        <w:rPr>
+          <w:rFonts w:ascii="Aptos" w:hAnsi="Aptos" w:eastAsia="Aptos" w:cs="Aptos"/>
+          <w:sz w:val="22"/>
+          <w:szCs w:val="22"/>
+          <w:lang w:val="en-US"/>
+        </w:rPr>
+        <w:t xml:space="preserve"> R0.00 (Internal Student Project)</w:t>
+      </w:r>
+    </w:p>
+    <w:p>
+      <w:pPr>
+        <w:pStyle w:val="7"/>
+        <w:numPr>
+          <w:ilvl w:val="0"/>
+          <w:numId w:val="5"/>
+        </w:numPr>
+        <w:bidi w:val="0"/>
+        <w:spacing w:before="240" w:beforeAutospacing="0" w:after="240" w:afterAutospacing="0"/>
+        <w:jc w:val="left"/>
+        <w:rPr>
+          <w:rFonts w:ascii="Aptos" w:hAnsi="Aptos" w:eastAsia="Aptos" w:cs="Aptos"/>
+          <w:sz w:val="22"/>
+          <w:szCs w:val="22"/>
+          <w:lang w:val="en-US"/>
+        </w:rPr>
+      </w:pPr>
+      <w:r>
+        <w:rPr>
+          <w:rFonts w:ascii="Aptos" w:hAnsi="Aptos" w:eastAsia="Aptos" w:cs="Aptos"/>
+          <w:b/>
+          <w:bCs/>
+          <w:sz w:val="22"/>
+          <w:szCs w:val="22"/>
+          <w:lang w:val="en-US"/>
+        </w:rPr>
+        <w:t>Photography Assets:</w:t>
+      </w:r>
+      <w:r>
+        <w:rPr>
+          <w:rFonts w:ascii="Aptos" w:hAnsi="Aptos" w:eastAsia="Aptos" w:cs="Aptos"/>
+          <w:sz w:val="22"/>
+          <w:szCs w:val="22"/>
+          <w:lang w:val="en-US"/>
+        </w:rPr>
+        <w:t xml:space="preserve"> R1,500.00 (Professional local shoot)</w:t>
+      </w:r>
+    </w:p>
+    <w:p>
+      <w:pPr>
+        <w:pStyle w:val="7"/>
+        <w:numPr>
+          <w:ilvl w:val="0"/>
+          <w:numId w:val="5"/>
+        </w:numPr>
+        <w:bidi w:val="0"/>
+        <w:spacing w:before="240" w:beforeAutospacing="0" w:after="240" w:afterAutospacing="0"/>
+        <w:jc w:val="left"/>
+        <w:rPr>
+          <w:rFonts w:ascii="Aptos" w:hAnsi="Aptos" w:eastAsia="Aptos" w:cs="Aptos"/>
+          <w:b/>
+          <w:bCs/>
+          <w:sz w:val="22"/>
+          <w:szCs w:val="22"/>
+          <w:lang w:val="en-US"/>
+        </w:rPr>
+      </w:pPr>
+      <w:r>
+        <w:rPr>
+          <w:rFonts w:ascii="Aptos" w:hAnsi="Aptos" w:eastAsia="Aptos" w:cs="Aptos"/>
+          <w:b/>
+          <w:bCs/>
+          <w:sz w:val="22"/>
+          <w:szCs w:val="22"/>
+          <w:lang w:val="en-US"/>
+        </w:rPr>
+        <w:t>Total Initial Outlay:</w:t>
+      </w:r>
+      <w:r>
+        <w:rPr>
+          <w:rFonts w:ascii="Aptos" w:hAnsi="Aptos" w:eastAsia="Aptos" w:cs="Aptos"/>
+          <w:sz w:val="22"/>
+          <w:szCs w:val="22"/>
+          <w:lang w:val="en-US"/>
+        </w:rPr>
+        <w:t xml:space="preserve"> R1,739.00</w:t>
+      </w:r>
+    </w:p>
+    <w:p>
+      <w:pPr>
+        <w:pStyle w:val="2"/>
+        <w:bidi w:val="0"/>
+        <w:spacing w:before="0" w:beforeAutospacing="0" w:after="281" w:afterAutospacing="0"/>
+        <w:jc w:val="left"/>
+        <w:rPr>
+          <w:rFonts w:ascii="Aptos" w:hAnsi="Aptos" w:eastAsia="Aptos" w:cs="Aptos"/>
+          <w:b/>
+          <w:bCs/>
+          <w:sz w:val="22"/>
+          <w:szCs w:val="22"/>
+          <w:lang w:val="en-US"/>
+        </w:rPr>
+      </w:pPr>
+      <w:r>
+        <w:rPr>
+          <w:rFonts w:ascii="Aptos" w:hAnsi="Aptos" w:eastAsia="Aptos" w:cs="Aptos"/>
+          <w:b/>
+          <w:bCs/>
+          <w:sz w:val="22"/>
+          <w:szCs w:val="22"/>
+          <w:lang w:val="en-US"/>
+        </w:rPr>
+        <w:t>8. REFERENCES</w:t>
       </w:r>
     </w:p>
     <w:p>
@@ -2383,16 +2651,65 @@
           <w:szCs w:val="22"/>
           <w:lang w:val="en-US"/>
         </w:rPr>
-        <w:t>Hosting (Basic):</w:t>
-      </w:r>
-      <w:r>
-        <w:rPr>
-          <w:rFonts w:ascii="Aptos" w:hAnsi="Aptos" w:eastAsia="Aptos" w:cs="Aptos"/>
-          <w:sz w:val="22"/>
-          <w:szCs w:val="22"/>
-          <w:lang w:val="en-US"/>
-        </w:rPr>
-        <w:t xml:space="preserve"> R150.00 (Monthly)</w:t>
+        <w:t>Interaction Design Foundation. (2025).</w:t>
+      </w:r>
+      <w:r>
+        <w:rPr>
+          <w:rFonts w:ascii="Aptos" w:hAnsi="Aptos" w:eastAsia="Aptos" w:cs="Aptos"/>
+          <w:sz w:val="22"/>
+          <w:szCs w:val="22"/>
+          <w:lang w:val="en-US"/>
+        </w:rPr>
+        <w:t xml:space="preserve"> </w:t>
+      </w:r>
+      <w:r>
+        <w:rPr>
+          <w:rFonts w:ascii="Aptos" w:hAnsi="Aptos" w:eastAsia="Aptos" w:cs="Aptos"/>
+          <w:i/>
+          <w:iCs/>
+          <w:sz w:val="22"/>
+          <w:szCs w:val="22"/>
+          <w:lang w:val="en-US"/>
+        </w:rPr>
+        <w:t>Visual hierarchy in web design: Principles for conversion.</w:t>
+      </w:r>
+      <w:r>
+        <w:rPr>
+          <w:rFonts w:ascii="Aptos" w:hAnsi="Aptos" w:eastAsia="Aptos" w:cs="Aptos"/>
+          <w:sz w:val="22"/>
+          <w:szCs w:val="22"/>
+          <w:lang w:val="en-US"/>
+        </w:rPr>
+        <w:t xml:space="preserve"> </w:t>
+      </w:r>
+      <w:r>
+        <w:fldChar w:fldCharType="begin"/>
+      </w:r>
+      <w:r>
+        <w:instrText xml:space="preserve"> HYPERLINK "https://www.interaction-design.org/" \h </w:instrText>
+      </w:r>
+      <w:r>
+        <w:fldChar w:fldCharType="separate"/>
+      </w:r>
+      <w:r>
+        <w:rPr>
+          <w:rStyle w:val="5"/>
+          <w:rFonts w:ascii="Aptos" w:hAnsi="Aptos" w:eastAsia="Aptos" w:cs="Aptos"/>
+          <w:sz w:val="22"/>
+          <w:szCs w:val="22"/>
+          <w:lang w:val="en-US"/>
+        </w:rPr>
+        <w:t>https://www.interaction-design.org</w:t>
+      </w:r>
+      <w:r>
+        <w:rPr>
+          <w:rStyle w:val="5"/>
+          <w:rFonts w:ascii="Aptos" w:hAnsi="Aptos" w:eastAsia="Aptos" w:cs="Aptos"/>
+          <w:sz w:val="22"/>
+          <w:szCs w:val="22"/>
+          <w:lang w:val="en-US"/>
+        </w:rPr>
+        <w:fldChar w:fldCharType="end"/>
       </w:r>
     </w:p>
     <w:p>
@@ -2404,33 +2721,81 @@
         </w:numPr>
         <w:bidi w:val="0"/>
         <w:spacing w:before="240" w:beforeAutospacing="0" w:after="240" w:afterAutospacing="0"/>
-        <w:jc w:val="left"/>
-        <w:rPr>
-          <w:rFonts w:ascii="Aptos" w:hAnsi="Aptos" w:eastAsia="Aptos" w:cs="Aptos"/>
-          <w:sz w:val="22"/>
-          <w:szCs w:val="22"/>
-          <w:lang w:val="en-US"/>
-        </w:rPr>
-      </w:pPr>
-      <w:r>
-        <w:rPr>
-          <w:rFonts w:ascii="Aptos" w:hAnsi="Aptos" w:eastAsia="Aptos" w:cs="Aptos"/>
-          <w:b/>
-          <w:bCs/>
-          <w:sz w:val="22"/>
-          <w:szCs w:val="22"/>
-          <w:lang w:val="en-US"/>
-        </w:rPr>
-        <w:t>Development:</w:t>
-      </w:r>
-      <w:r>
-        <w:rPr>
-          <w:rFonts w:ascii="Aptos" w:hAnsi="Aptos" w:eastAsia="Aptos" w:cs="Aptos"/>
-          <w:sz w:val="22"/>
-          <w:szCs w:val="22"/>
-          <w:lang w:val="en-US"/>
-        </w:rPr>
-        <w:t xml:space="preserve"> R0.00 (Internal Student Project)</w:t>
+        <w:rPr>
+          <w:rFonts w:ascii="Aptos" w:hAnsi="Aptos" w:eastAsia="Aptos" w:cs="Aptos"/>
+          <w:sz w:val="22"/>
+          <w:szCs w:val="22"/>
+          <w:lang w:val="en-US"/>
+        </w:rPr>
+      </w:pPr>
+      <w:r>
+        <w:rPr>
+          <w:rFonts w:ascii="Aptos" w:hAnsi="Aptos" w:eastAsia="Aptos" w:cs="Aptos"/>
+          <w:b/>
+          <w:bCs/>
+          <w:sz w:val="22"/>
+          <w:szCs w:val="22"/>
+          <w:lang w:val="en-US"/>
+        </w:rPr>
+        <w:t>Statista. (2025).</w:t>
+      </w:r>
+      <w:r>
+        <w:rPr>
+          <w:rFonts w:ascii="Aptos" w:hAnsi="Aptos" w:eastAsia="Aptos" w:cs="Aptos"/>
+          <w:sz w:val="22"/>
+          <w:szCs w:val="22"/>
+          <w:lang w:val="en-US"/>
+        </w:rPr>
+        <w:t xml:space="preserve"> </w:t>
+      </w:r>
+      <w:r>
+        <w:rPr>
+          <w:rFonts w:ascii="Aptos" w:hAnsi="Aptos" w:eastAsia="Aptos" w:cs="Aptos"/>
+          <w:i/>
+          <w:iCs/>
+          <w:sz w:val="22"/>
+          <w:szCs w:val="22"/>
+          <w:lang w:val="en-US"/>
+        </w:rPr>
+        <w:t>Internet user penetration and digital trends in South Africa.</w:t>
+      </w:r>
+      <w:r>
+        <w:rPr>
+          <w:rFonts w:ascii="Aptos" w:hAnsi="Aptos" w:eastAsia="Aptos" w:cs="Aptos"/>
+          <w:sz w:val="22"/>
+          <w:szCs w:val="22"/>
+          <w:lang w:val="en-US"/>
+        </w:rPr>
+        <w:t xml:space="preserve"> </w:t>
+      </w:r>
+      <w:r>
+        <w:fldChar w:fldCharType="begin"/>
+      </w:r>
+      <w:r>
+        <w:instrText xml:space="preserve"> HYPERLINK "https://www.statista.com/" \h </w:instrText>
+      </w:r>
+      <w:r>
+        <w:fldChar w:fldCharType="separate"/>
+      </w:r>
+      <w:r>
+        <w:rPr>
+          <w:rStyle w:val="5"/>
+          <w:rFonts w:ascii="Aptos" w:hAnsi="Aptos" w:eastAsia="Aptos" w:cs="Aptos"/>
+          <w:sz w:val="22"/>
+          <w:szCs w:val="22"/>
+          <w:lang w:val="en-US"/>
+        </w:rPr>
+        <w:t>https://www.statista.com</w:t>
+      </w:r>
+      <w:r>
+        <w:rPr>
+          <w:rStyle w:val="5"/>
+          <w:rFonts w:ascii="Aptos" w:hAnsi="Aptos" w:eastAsia="Aptos" w:cs="Aptos"/>
+          <w:sz w:val="22"/>
+          <w:szCs w:val="22"/>
+          <w:lang w:val="en-US"/>
+        </w:rPr>
+        <w:fldChar w:fldCharType="end"/>
       </w:r>
     </w:p>
     <w:p>
@@ -2439,284 +2804,6 @@
         <w:numPr>
           <w:ilvl w:val="0"/>
           <w:numId w:val="6"/>
-        </w:numPr>
-        <w:bidi w:val="0"/>
-        <w:spacing w:before="240" w:beforeAutospacing="0" w:after="240" w:afterAutospacing="0"/>
-        <w:jc w:val="left"/>
-        <w:rPr>
-          <w:rFonts w:ascii="Aptos" w:hAnsi="Aptos" w:eastAsia="Aptos" w:cs="Aptos"/>
-          <w:sz w:val="22"/>
-          <w:szCs w:val="22"/>
-          <w:lang w:val="en-US"/>
-        </w:rPr>
-      </w:pPr>
-      <w:r>
-        <w:rPr>
-          <w:rFonts w:ascii="Aptos" w:hAnsi="Aptos" w:eastAsia="Aptos" w:cs="Aptos"/>
-          <w:b/>
-          <w:bCs/>
-          <w:sz w:val="22"/>
-          <w:szCs w:val="22"/>
-          <w:lang w:val="en-US"/>
-        </w:rPr>
-        <w:t>Photography Assets:</w:t>
-      </w:r>
-      <w:r>
-        <w:rPr>
-          <w:rFonts w:ascii="Aptos" w:hAnsi="Aptos" w:eastAsia="Aptos" w:cs="Aptos"/>
-          <w:sz w:val="22"/>
-          <w:szCs w:val="22"/>
-          <w:lang w:val="en-US"/>
-        </w:rPr>
-        <w:t xml:space="preserve"> R1,500.00 (Professional local shoot)</w:t>
-      </w:r>
-    </w:p>
-    <w:p>
-      <w:pPr>
-        <w:pStyle w:val="7"/>
-        <w:numPr>
-          <w:ilvl w:val="0"/>
-          <w:numId w:val="6"/>
-        </w:numPr>
-        <w:bidi w:val="0"/>
-        <w:spacing w:before="240" w:beforeAutospacing="0" w:after="240" w:afterAutospacing="0"/>
-        <w:jc w:val="left"/>
-        <w:rPr>
-          <w:rFonts w:ascii="Aptos" w:hAnsi="Aptos" w:eastAsia="Aptos" w:cs="Aptos"/>
-          <w:b/>
-          <w:bCs/>
-          <w:sz w:val="22"/>
-          <w:szCs w:val="22"/>
-          <w:lang w:val="en-US"/>
-        </w:rPr>
-      </w:pPr>
-      <w:r>
-        <w:rPr>
-          <w:rFonts w:ascii="Aptos" w:hAnsi="Aptos" w:eastAsia="Aptos" w:cs="Aptos"/>
-          <w:b/>
-          <w:bCs/>
-          <w:sz w:val="22"/>
-          <w:szCs w:val="22"/>
-          <w:lang w:val="en-US"/>
-        </w:rPr>
-        <w:t>Total Initial Outlay:</w:t>
-      </w:r>
-      <w:r>
-        <w:rPr>
-          <w:rFonts w:ascii="Aptos" w:hAnsi="Aptos" w:eastAsia="Aptos" w:cs="Aptos"/>
-          <w:sz w:val="22"/>
-          <w:szCs w:val="22"/>
-          <w:lang w:val="en-US"/>
-        </w:rPr>
-        <w:t xml:space="preserve"> R1,739.00</w:t>
-      </w:r>
-    </w:p>
-    <w:p>
-      <w:pPr>
-        <w:pStyle w:val="2"/>
-        <w:bidi w:val="0"/>
-        <w:spacing w:before="0" w:beforeAutospacing="0" w:after="281" w:afterAutospacing="0"/>
-        <w:jc w:val="left"/>
-        <w:rPr>
-          <w:rFonts w:ascii="Aptos" w:hAnsi="Aptos" w:eastAsia="Aptos" w:cs="Aptos"/>
-          <w:b/>
-          <w:bCs/>
-          <w:sz w:val="22"/>
-          <w:szCs w:val="22"/>
-          <w:lang w:val="en-US"/>
-        </w:rPr>
-      </w:pPr>
-      <w:r>
-        <w:rPr>
-          <w:rFonts w:ascii="Aptos" w:hAnsi="Aptos" w:eastAsia="Aptos" w:cs="Aptos"/>
-          <w:b/>
-          <w:bCs/>
-          <w:sz w:val="22"/>
-          <w:szCs w:val="22"/>
-          <w:lang w:val="en-US"/>
-        </w:rPr>
-        <w:t>8. REFERENCES</w:t>
-      </w:r>
-    </w:p>
-    <w:p>
-      <w:pPr>
-        <w:pStyle w:val="7"/>
-        <w:numPr>
-          <w:ilvl w:val="0"/>
-          <w:numId w:val="7"/>
-        </w:numPr>
-        <w:bidi w:val="0"/>
-        <w:spacing w:before="240" w:beforeAutospacing="0" w:after="240" w:afterAutospacing="0"/>
-        <w:jc w:val="left"/>
-        <w:rPr>
-          <w:rFonts w:ascii="Aptos" w:hAnsi="Aptos" w:eastAsia="Aptos" w:cs="Aptos"/>
-          <w:sz w:val="22"/>
-          <w:szCs w:val="22"/>
-          <w:lang w:val="en-US"/>
-        </w:rPr>
-      </w:pPr>
-      <w:r>
-        <w:rPr>
-          <w:rFonts w:ascii="Aptos" w:hAnsi="Aptos" w:eastAsia="Aptos" w:cs="Aptos"/>
-          <w:b/>
-          <w:bCs/>
-          <w:sz w:val="22"/>
-          <w:szCs w:val="22"/>
-          <w:lang w:val="en-US"/>
-        </w:rPr>
-        <w:t>Interaction Design Foundation. (2025).</w:t>
-      </w:r>
-      <w:r>
-        <w:rPr>
-          <w:rFonts w:ascii="Aptos" w:hAnsi="Aptos" w:eastAsia="Aptos" w:cs="Aptos"/>
-          <w:sz w:val="22"/>
-          <w:szCs w:val="22"/>
-          <w:lang w:val="en-US"/>
-        </w:rPr>
-        <w:t xml:space="preserve"> </w:t>
-      </w:r>
-      <w:r>
-        <w:rPr>
-          <w:rFonts w:ascii="Aptos" w:hAnsi="Aptos" w:eastAsia="Aptos" w:cs="Aptos"/>
-          <w:i/>
-          <w:iCs/>
-          <w:sz w:val="22"/>
-          <w:szCs w:val="22"/>
-          <w:lang w:val="en-US"/>
-        </w:rPr>
-        <w:t>Visual hierarchy in web design: Principles for conversion.</w:t>
-      </w:r>
-      <w:r>
-        <w:rPr>
-          <w:rFonts w:ascii="Aptos" w:hAnsi="Aptos" w:eastAsia="Aptos" w:cs="Aptos"/>
-          <w:sz w:val="22"/>
-          <w:szCs w:val="22"/>
-          <w:lang w:val="en-US"/>
-        </w:rPr>
-        <w:t xml:space="preserve"> </w:t>
-      </w:r>
-      <w:r>
-        <w:fldChar w:fldCharType="begin"/>
-      </w:r>
-      <w:r>
-        <w:instrText xml:space="preserve"> HYPERLINK "https://www.interaction-design.org/" \h </w:instrText>
-      </w:r>
-      <w:r>
-        <w:fldChar w:fldCharType="separate"/>
-      </w:r>
-      <w:r>
-        <w:rPr>
-          <w:rStyle w:val="5"/>
-          <w:rFonts w:ascii="Aptos" w:hAnsi="Aptos" w:eastAsia="Aptos" w:cs="Aptos"/>
-          <w:sz w:val="22"/>
-          <w:szCs w:val="22"/>
-          <w:lang w:val="en-US"/>
-        </w:rPr>
-        <w:t>https://www.interaction-design.org</w:t>
-      </w:r>
-      <w:r>
-        <w:rPr>
-          <w:rStyle w:val="5"/>
-          <w:rFonts w:ascii="Aptos" w:hAnsi="Aptos" w:eastAsia="Aptos" w:cs="Aptos"/>
-          <w:sz w:val="22"/>
-          <w:szCs w:val="22"/>
-          <w:lang w:val="en-US"/>
-        </w:rPr>
-        <w:fldChar w:fldCharType="end"/>
-      </w:r>
-    </w:p>
-    <w:p>
-      <w:pPr>
-        <w:pStyle w:val="7"/>
-        <w:numPr>
-          <w:ilvl w:val="0"/>
-          <w:numId w:val="7"/>
-        </w:numPr>
-        <w:bidi w:val="0"/>
-        <w:spacing w:before="240" w:beforeAutospacing="0" w:after="240" w:afterAutospacing="0"/>
-        <w:rPr>
-          <w:rFonts w:ascii="Aptos" w:hAnsi="Aptos" w:eastAsia="Aptos" w:cs="Aptos"/>
-          <w:sz w:val="22"/>
-          <w:szCs w:val="22"/>
-          <w:lang w:val="en-US"/>
-        </w:rPr>
-      </w:pPr>
-      <w:r>
-        <w:rPr>
-          <w:rFonts w:ascii="Aptos" w:hAnsi="Aptos" w:eastAsia="Aptos" w:cs="Aptos"/>
-          <w:b/>
-          <w:bCs/>
-          <w:sz w:val="22"/>
-          <w:szCs w:val="22"/>
-          <w:lang w:val="en-US"/>
-        </w:rPr>
-        <w:t>Statista. (2025).</w:t>
-      </w:r>
-      <w:r>
-        <w:rPr>
-          <w:rFonts w:ascii="Aptos" w:hAnsi="Aptos" w:eastAsia="Aptos" w:cs="Aptos"/>
-          <w:sz w:val="22"/>
-          <w:szCs w:val="22"/>
-          <w:lang w:val="en-US"/>
-        </w:rPr>
-        <w:t xml:space="preserve"> </w:t>
-      </w:r>
-      <w:r>
-        <w:rPr>
-          <w:rFonts w:ascii="Aptos" w:hAnsi="Aptos" w:eastAsia="Aptos" w:cs="Aptos"/>
-          <w:i/>
-          <w:iCs/>
-          <w:sz w:val="22"/>
-          <w:szCs w:val="22"/>
-          <w:lang w:val="en-US"/>
-        </w:rPr>
-        <w:t>Internet user penetration and digital trends in South Africa.</w:t>
-      </w:r>
-      <w:r>
-        <w:rPr>
-          <w:rFonts w:ascii="Aptos" w:hAnsi="Aptos" w:eastAsia="Aptos" w:cs="Aptos"/>
-          <w:sz w:val="22"/>
-          <w:szCs w:val="22"/>
-          <w:lang w:val="en-US"/>
-        </w:rPr>
-        <w:t xml:space="preserve"> </w:t>
-      </w:r>
-      <w:r>
-        <w:fldChar w:fldCharType="begin"/>
-      </w:r>
-      <w:r>
-        <w:instrText xml:space="preserve"> HYPERLINK "https://www.statista.com/" \h </w:instrText>
-      </w:r>
-      <w:r>
-        <w:fldChar w:fldCharType="separate"/>
-      </w:r>
-      <w:r>
-        <w:rPr>
-          <w:rStyle w:val="5"/>
-          <w:rFonts w:ascii="Aptos" w:hAnsi="Aptos" w:eastAsia="Aptos" w:cs="Aptos"/>
-          <w:sz w:val="22"/>
-          <w:szCs w:val="22"/>
-          <w:lang w:val="en-US"/>
-        </w:rPr>
-        <w:t>https://www.statista.com</w:t>
-      </w:r>
-      <w:r>
-        <w:rPr>
-          <w:rStyle w:val="5"/>
-          <w:rFonts w:ascii="Aptos" w:hAnsi="Aptos" w:eastAsia="Aptos" w:cs="Aptos"/>
-          <w:sz w:val="22"/>
-          <w:szCs w:val="22"/>
-          <w:lang w:val="en-US"/>
-        </w:rPr>
-        <w:fldChar w:fldCharType="end"/>
-      </w:r>
-    </w:p>
-    <w:p>
-      <w:pPr>
-        <w:pStyle w:val="7"/>
-        <w:numPr>
-          <w:ilvl w:val="0"/>
-          <w:numId w:val="7"/>
         </w:numPr>
         <w:bidi w:val="0"/>
         <w:spacing w:before="240" w:beforeAutospacing="0" w:after="240" w:afterAutospacing="0"/>
@@ -2999,119 +3086,6 @@
     </w:lvl>
   </w:abstractNum>
   <w:abstractNum w:abstractNumId="1">
-    <w:nsid w:val="04C1D446"/>
-    <w:multiLevelType w:val="multilevel"/>
-    <w:tmpl w:val="04C1D446"/>
-    <w:lvl w:ilvl="0" w:tentative="0">
-      <w:start w:val="1"/>
-      <w:numFmt w:val="bullet"/>
-      <w:lvlText w:val=""/>
-      <w:lvlJc w:val="left"/>
-      <w:pPr>
-        <w:ind w:left="720" w:hanging="360"/>
-      </w:pPr>
-      <w:rPr>
-        <w:rFonts w:hint="default" w:ascii="Symbol" w:hAnsi="Symbol"/>
-      </w:rPr>
-    </w:lvl>
-    <w:lvl w:ilvl="1" w:tentative="0">
-      <w:start w:val="1"/>
-      <w:numFmt w:val="bullet"/>
-      <w:lvlText w:val="o"/>
-      <w:lvlJc w:val="left"/>
-      <w:pPr>
-        <w:ind w:left="1440" w:hanging="360"/>
-      </w:pPr>
-      <w:rPr>
-        <w:rFonts w:hint="default" w:ascii="Courier New" w:hAnsi="Courier New"/>
-      </w:rPr>
-    </w:lvl>
-    <w:lvl w:ilvl="2" w:tentative="0">
-      <w:start w:val="1"/>
-      <w:numFmt w:val="bullet"/>
-      <w:lvlText w:val=""/>
-      <w:lvlJc w:val="left"/>
-      <w:pPr>
-        <w:ind w:left="2160" w:hanging="360"/>
-      </w:pPr>
-      <w:rPr>
-        <w:rFonts w:hint="default" w:ascii="Wingdings" w:hAnsi="Wingdings"/>
-      </w:rPr>
-    </w:lvl>
-    <w:lvl w:ilvl="3" w:tentative="0">
-      <w:start w:val="1"/>
-      <w:numFmt w:val="bullet"/>
-      <w:lvlText w:val=""/>
-      <w:lvlJc w:val="left"/>
-      <w:pPr>
-        <w:ind w:left="2880" w:hanging="360"/>
-      </w:pPr>
-      <w:rPr>
-        <w:rFonts w:hint="default" w:ascii="Symbol" w:hAnsi="Symbol"/>
-      </w:rPr>
-    </w:lvl>
-    <w:lvl w:ilvl="4" w:tentative="0">
-      <w:start w:val="1"/>
-      <w:numFmt w:val="bullet"/>
-      <w:lvlText w:val="o"/>
-      <w:lvlJc w:val="left"/>
-      <w:pPr>
-        <w:ind w:left="3600" w:hanging="360"/>
-      </w:pPr>
-      <w:rPr>
-        <w:rFonts w:hint="default" w:ascii="Courier New" w:hAnsi="Courier New"/>
-      </w:rPr>
-    </w:lvl>
-    <w:lvl w:ilvl="5" w:tentative="0">
-      <w:start w:val="1"/>
-      <w:numFmt w:val="bullet"/>
-      <w:lvlText w:val=""/>
-      <w:lvlJc w:val="left"/>
-      <w:pPr>
-        <w:ind w:left="4320" w:hanging="360"/>
-      </w:pPr>
-      <w:rPr>
-        <w:rFonts w:hint="default" w:ascii="Wingdings" w:hAnsi="Wingdings"/>
-      </w:rPr>
-    </w:lvl>
-    <w:lvl w:ilvl="6" w:tentative="0">
-      <w:start w:val="1"/>
-      <w:numFmt w:val="bullet"/>
-      <w:lvlText w:val=""/>
-      <w:lvlJc w:val="left"/>
-      <w:pPr>
-        <w:ind w:left="5040" w:hanging="360"/>
-      </w:pPr>
-      <w:rPr>
-        <w:rFonts w:hint="default" w:ascii="Symbol" w:hAnsi="Symbol"/>
-      </w:rPr>
-    </w:lvl>
-    <w:lvl w:ilvl="7" w:tentative="0">
-      <w:start w:val="1"/>
-      <w:numFmt w:val="bullet"/>
-      <w:lvlText w:val="o"/>
-      <w:lvlJc w:val="left"/>
-      <w:pPr>
-        <w:ind w:left="5760" w:hanging="360"/>
-      </w:pPr>
-      <w:rPr>
-        <w:rFonts w:hint="default" w:ascii="Courier New" w:hAnsi="Courier New"/>
-      </w:rPr>
-    </w:lvl>
-    <w:lvl w:ilvl="8" w:tentative="0">
-      <w:start w:val="1"/>
-      <w:numFmt w:val="bullet"/>
-      <w:lvlText w:val=""/>
-      <w:lvlJc w:val="left"/>
-      <w:pPr>
-        <w:ind w:left="6480" w:hanging="360"/>
-      </w:pPr>
-      <w:rPr>
-        <w:rFonts w:hint="default" w:ascii="Wingdings" w:hAnsi="Wingdings"/>
-      </w:rPr>
-    </w:lvl>
-  </w:abstractNum>
-  <w:abstractNum w:abstractNumId="2">
     <w:nsid w:val="30B2E34E"/>
     <w:multiLevelType w:val="multilevel"/>
     <w:tmpl w:val="30B2E34E"/>
@@ -3224,7 +3198,7 @@
       </w:rPr>
     </w:lvl>
   </w:abstractNum>
-  <w:abstractNum w:abstractNumId="3">
+  <w:abstractNum w:abstractNumId="2">
     <w:nsid w:val="54900234"/>
     <w:multiLevelType w:val="multilevel"/>
     <w:tmpl w:val="54900234"/>
@@ -3310,7 +3284,7 @@
       </w:pPr>
     </w:lvl>
   </w:abstractNum>
-  <w:abstractNum w:abstractNumId="4">
+  <w:abstractNum w:abstractNumId="3">
     <w:nsid w:val="5B936E67"/>
     <w:multiLevelType w:val="multilevel"/>
     <w:tmpl w:val="5B936E67"/>
@@ -3423,7 +3397,7 @@
       </w:rPr>
     </w:lvl>
   </w:abstractNum>
-  <w:abstractNum w:abstractNumId="5">
+  <w:abstractNum w:abstractNumId="4">
     <w:nsid w:val="66D5B1DA"/>
     <w:multiLevelType w:val="multilevel"/>
     <w:tmpl w:val="66D5B1DA"/>
@@ -3536,7 +3510,7 @@
       </w:rPr>
     </w:lvl>
   </w:abstractNum>
-  <w:abstractNum w:abstractNumId="6">
+  <w:abstractNum w:abstractNumId="5">
     <w:nsid w:val="6B2DC4F5"/>
     <w:multiLevelType w:val="multilevel"/>
     <w:tmpl w:val="6B2DC4F5"/>
@@ -3650,25 +3624,22 @@
     </w:lvl>
   </w:abstractNum>
   <w:num w:numId="1">
-    <w:abstractNumId w:val="3"/>
+    <w:abstractNumId w:val="2"/>
   </w:num>
   <w:num w:numId="2">
+    <w:abstractNumId w:val="4"/>
+  </w:num>
+  <w:num w:numId="3">
     <w:abstractNumId w:val="5"/>
   </w:num>
-  <w:num w:numId="3">
-    <w:abstractNumId w:val="6"/>
+  <w:num w:numId="4">
+    <w:abstractNumId w:val="0"/>
   </w:num>
-  <w:num w:numId="4">
+  <w:num w:numId="5">
     <w:abstractNumId w:val="1"/>
   </w:num>
-  <w:num w:numId="5">
-    <w:abstractNumId w:val="0"/>
-  </w:num>
   <w:num w:numId="6">
-    <w:abstractNumId w:val="2"/>
-  </w:num>
-  <w:num w:numId="7">
-    <w:abstractNumId w:val="4"/>
+    <w:abstractNumId w:val="3"/>
   </w:num>
 </w:numbering>
 </file>

</xml_diff>